<commit_message>
week3day2 notes added, how restapis work over http notes added in personal notes
</commit_message>
<xml_diff>
--- a/editable notes/PIP Personal.docx
+++ b/editable notes/PIP Personal.docx
@@ -4478,6 +4478,3316 @@
         </w:rPr>
         <w:t xml:space="preserve">--- </w:t>
       </w:r>
+    </w:p>
+    <w:p>
+      <w:pPr>
+        <w:rPr>
+          <w:sz w:val="32"/>
+          <w:szCs w:val="32"/>
+        </w:rPr>
+      </w:pPr>
+    </w:p>
+    <w:p>
+      <w:pPr>
+        <w:rPr>
+          <w:sz w:val="32"/>
+          <w:szCs w:val="32"/>
+        </w:rPr>
+      </w:pPr>
+    </w:p>
+    <w:p>
+      <w:pPr>
+        <w:jc w:val="center"/>
+        <w:rPr>
+          <w:sz w:val="48"/>
+          <w:szCs w:val="48"/>
+        </w:rPr>
+      </w:pPr>
+    </w:p>
+    <w:p>
+      <w:pPr>
+        <w:jc w:val="center"/>
+        <w:rPr>
+          <w:sz w:val="48"/>
+          <w:szCs w:val="48"/>
+        </w:rPr>
+      </w:pPr>
+      <w:r>
+        <w:rPr>
+          <w:b/>
+          <w:bCs/>
+          <w:sz w:val="48"/>
+          <w:szCs w:val="48"/>
+        </w:rPr>
+        <w:t>H</w:t>
+      </w:r>
+      <w:r>
+        <w:rPr>
+          <w:b/>
+          <w:bCs/>
+          <w:sz w:val="48"/>
+          <w:szCs w:val="48"/>
+        </w:rPr>
+        <w:t xml:space="preserve">ow the HTTP protocol and controllers actually </w:t>
+      </w:r>
+      <w:proofErr w:type="gramStart"/>
+      <w:r>
+        <w:rPr>
+          <w:b/>
+          <w:bCs/>
+          <w:sz w:val="48"/>
+          <w:szCs w:val="48"/>
+        </w:rPr>
+        <w:t>work</w:t>
+      </w:r>
+      <w:r>
+        <w:rPr>
+          <w:b/>
+          <w:bCs/>
+          <w:sz w:val="48"/>
+          <w:szCs w:val="48"/>
+        </w:rPr>
+        <w:t xml:space="preserve"> ?</w:t>
+      </w:r>
+      <w:proofErr w:type="gramEnd"/>
+    </w:p>
+    <w:p>
+      <w:pPr>
+        <w:rPr>
+          <w:sz w:val="32"/>
+          <w:szCs w:val="32"/>
+        </w:rPr>
+      </w:pPr>
+      <w:r>
+        <w:rPr>
+          <w:sz w:val="32"/>
+          <w:szCs w:val="32"/>
+        </w:rPr>
+        <w:pict w14:anchorId="0172F680">
+          <v:rect id="_x0000_i1093" style="width:0;height:1.5pt" o:hralign="center" o:hrstd="t" o:hr="t" fillcolor="#a0a0a0" stroked="f"/>
+        </w:pict>
+      </w:r>
+    </w:p>
+    <w:p>
+      <w:pPr>
+        <w:rPr>
+          <w:b/>
+          <w:bCs/>
+          <w:sz w:val="32"/>
+          <w:szCs w:val="32"/>
+        </w:rPr>
+      </w:pPr>
+      <w:r>
+        <w:rPr>
+          <w:b/>
+          <w:bCs/>
+          <w:sz w:val="32"/>
+          <w:szCs w:val="32"/>
+        </w:rPr>
+        <w:t>1️</w:t>
+      </w:r>
+      <w:r>
+        <w:rPr>
+          <w:rFonts w:ascii="Segoe UI Symbol" w:hAnsi="Segoe UI Symbol" w:cs="Segoe UI Symbol"/>
+          <w:b/>
+          <w:bCs/>
+          <w:sz w:val="32"/>
+          <w:szCs w:val="32"/>
+        </w:rPr>
+        <w:t>⃣</w:t>
+      </w:r>
+      <w:r>
+        <w:rPr>
+          <w:b/>
+          <w:bCs/>
+          <w:sz w:val="32"/>
+          <w:szCs w:val="32"/>
+        </w:rPr>
+        <w:t xml:space="preserve"> How Spring decides which controller method runs</w:t>
+      </w:r>
+    </w:p>
+    <w:p>
+      <w:pPr>
+        <w:rPr>
+          <w:sz w:val="32"/>
+          <w:szCs w:val="32"/>
+        </w:rPr>
+      </w:pPr>
+      <w:r>
+        <w:rPr>
+          <w:sz w:val="32"/>
+          <w:szCs w:val="32"/>
+        </w:rPr>
+        <w:t xml:space="preserve">When a client sends a request, Spring matches </w:t>
+      </w:r>
+      <w:r>
+        <w:rPr>
+          <w:b/>
+          <w:bCs/>
+          <w:sz w:val="32"/>
+          <w:szCs w:val="32"/>
+        </w:rPr>
+        <w:t>two things</w:t>
+      </w:r>
+      <w:r>
+        <w:rPr>
+          <w:sz w:val="32"/>
+          <w:szCs w:val="32"/>
+        </w:rPr>
+        <w:t>:</w:t>
+      </w:r>
+    </w:p>
+    <w:p>
+      <w:pPr>
+        <w:numPr>
+          <w:ilvl w:val="0"/>
+          <w:numId w:val="17"/>
+        </w:numPr>
+        <w:rPr>
+          <w:sz w:val="32"/>
+          <w:szCs w:val="32"/>
+        </w:rPr>
+      </w:pPr>
+      <w:r>
+        <w:rPr>
+          <w:b/>
+          <w:bCs/>
+          <w:sz w:val="32"/>
+          <w:szCs w:val="32"/>
+        </w:rPr>
+        <w:t>URL path</w:t>
+      </w:r>
+    </w:p>
+    <w:p>
+      <w:pPr>
+        <w:numPr>
+          <w:ilvl w:val="0"/>
+          <w:numId w:val="17"/>
+        </w:numPr>
+        <w:rPr>
+          <w:sz w:val="32"/>
+          <w:szCs w:val="32"/>
+        </w:rPr>
+      </w:pPr>
+      <w:r>
+        <w:rPr>
+          <w:b/>
+          <w:bCs/>
+          <w:sz w:val="32"/>
+          <w:szCs w:val="32"/>
+        </w:rPr>
+        <w:t>HTTP method</w:t>
+      </w:r>
+    </w:p>
+    <w:p>
+      <w:pPr>
+        <w:rPr>
+          <w:sz w:val="32"/>
+          <w:szCs w:val="32"/>
+        </w:rPr>
+      </w:pPr>
+      <w:r>
+        <w:rPr>
+          <w:sz w:val="32"/>
+          <w:szCs w:val="32"/>
+        </w:rPr>
+        <w:t>Example request from client:</w:t>
+      </w:r>
+    </w:p>
+    <w:p>
+      <w:pPr>
+        <w:rPr>
+          <w:sz w:val="32"/>
+          <w:szCs w:val="32"/>
+        </w:rPr>
+      </w:pPr>
+      <w:r>
+        <w:rPr>
+          <w:sz w:val="32"/>
+          <w:szCs w:val="32"/>
+        </w:rPr>
+        <w:t>POST /users/101</w:t>
+      </w:r>
+    </w:p>
+    <w:p>
+      <w:pPr>
+        <w:rPr>
+          <w:sz w:val="32"/>
+          <w:szCs w:val="32"/>
+        </w:rPr>
+      </w:pPr>
+      <w:r>
+        <w:rPr>
+          <w:sz w:val="32"/>
+          <w:szCs w:val="32"/>
+        </w:rPr>
+        <w:t>Spring searches for a controller method that matches:</w:t>
+      </w:r>
+    </w:p>
+    <w:p>
+      <w:pPr>
+        <w:rPr>
+          <w:sz w:val="32"/>
+          <w:szCs w:val="32"/>
+        </w:rPr>
+      </w:pPr>
+      <w:r>
+        <w:rPr>
+          <w:sz w:val="32"/>
+          <w:szCs w:val="32"/>
+        </w:rPr>
+        <w:t>POST + /users/101</w:t>
+      </w:r>
+    </w:p>
+    <w:p>
+      <w:pPr>
+        <w:rPr>
+          <w:sz w:val="32"/>
+          <w:szCs w:val="32"/>
+        </w:rPr>
+      </w:pPr>
+      <w:r>
+        <w:rPr>
+          <w:sz w:val="32"/>
+          <w:szCs w:val="32"/>
+        </w:rPr>
+        <w:t>Example controller:</w:t>
+      </w:r>
+    </w:p>
+    <w:p>
+      <w:pPr>
+        <w:rPr>
+          <w:sz w:val="32"/>
+          <w:szCs w:val="32"/>
+        </w:rPr>
+      </w:pPr>
+      <w:r>
+        <w:rPr>
+          <w:sz w:val="32"/>
+          <w:szCs w:val="32"/>
+        </w:rPr>
+        <w:t>@RestController</w:t>
+      </w:r>
+    </w:p>
+    <w:p>
+      <w:pPr>
+        <w:rPr>
+          <w:sz w:val="32"/>
+          <w:szCs w:val="32"/>
+        </w:rPr>
+      </w:pPr>
+      <w:r>
+        <w:rPr>
+          <w:sz w:val="32"/>
+          <w:szCs w:val="32"/>
+        </w:rPr>
+        <w:t>@RequestMapping("/users")</w:t>
+      </w:r>
+    </w:p>
+    <w:p>
+      <w:pPr>
+        <w:rPr>
+          <w:sz w:val="32"/>
+          <w:szCs w:val="32"/>
+        </w:rPr>
+      </w:pPr>
+      <w:r>
+        <w:rPr>
+          <w:sz w:val="32"/>
+          <w:szCs w:val="32"/>
+        </w:rPr>
+        <w:lastRenderedPageBreak/>
+        <w:t xml:space="preserve">public class </w:t>
+      </w:r>
+      <w:proofErr w:type="spellStart"/>
+      <w:r>
+        <w:rPr>
+          <w:sz w:val="32"/>
+          <w:szCs w:val="32"/>
+        </w:rPr>
+        <w:t>UserController</w:t>
+      </w:r>
+      <w:proofErr w:type="spellEnd"/>
+      <w:r>
+        <w:rPr>
+          <w:sz w:val="32"/>
+          <w:szCs w:val="32"/>
+        </w:rPr>
+        <w:t xml:space="preserve"> {</w:t>
+      </w:r>
+    </w:p>
+    <w:p>
+      <w:pPr>
+        <w:rPr>
+          <w:sz w:val="32"/>
+          <w:szCs w:val="32"/>
+        </w:rPr>
+      </w:pPr>
+    </w:p>
+    <w:p>
+      <w:pPr>
+        <w:rPr>
+          <w:sz w:val="32"/>
+          <w:szCs w:val="32"/>
+        </w:rPr>
+      </w:pPr>
+      <w:r>
+        <w:rPr>
+          <w:sz w:val="32"/>
+          <w:szCs w:val="32"/>
+        </w:rPr>
+        <w:t xml:space="preserve">    @PostMapping("/{id}")</w:t>
+      </w:r>
+    </w:p>
+    <w:p>
+      <w:pPr>
+        <w:rPr>
+          <w:sz w:val="32"/>
+          <w:szCs w:val="32"/>
+        </w:rPr>
+      </w:pPr>
+      <w:r>
+        <w:rPr>
+          <w:sz w:val="32"/>
+          <w:szCs w:val="32"/>
+        </w:rPr>
+        <w:t xml:space="preserve">    public String </w:t>
+      </w:r>
+      <w:proofErr w:type="spellStart"/>
+      <w:proofErr w:type="gramStart"/>
+      <w:r>
+        <w:rPr>
+          <w:sz w:val="32"/>
+          <w:szCs w:val="32"/>
+        </w:rPr>
+        <w:t>createUser</w:t>
+      </w:r>
+      <w:proofErr w:type="spellEnd"/>
+      <w:r>
+        <w:rPr>
+          <w:sz w:val="32"/>
+          <w:szCs w:val="32"/>
+        </w:rPr>
+        <w:t>(</w:t>
+      </w:r>
+      <w:proofErr w:type="gramEnd"/>
+      <w:r>
+        <w:rPr>
+          <w:sz w:val="32"/>
+          <w:szCs w:val="32"/>
+        </w:rPr>
+        <w:t>@PathVariable int id) {</w:t>
+      </w:r>
+    </w:p>
+    <w:p>
+      <w:pPr>
+        <w:rPr>
+          <w:sz w:val="32"/>
+          <w:szCs w:val="32"/>
+        </w:rPr>
+      </w:pPr>
+      <w:r>
+        <w:rPr>
+          <w:sz w:val="32"/>
+          <w:szCs w:val="32"/>
+        </w:rPr>
+        <w:t xml:space="preserve">        return "User id: " + id;</w:t>
+      </w:r>
+    </w:p>
+    <w:p>
+      <w:pPr>
+        <w:rPr>
+          <w:sz w:val="32"/>
+          <w:szCs w:val="32"/>
+        </w:rPr>
+      </w:pPr>
+      <w:r>
+        <w:rPr>
+          <w:sz w:val="32"/>
+          <w:szCs w:val="32"/>
+        </w:rPr>
+        <w:t xml:space="preserve">    }</w:t>
+      </w:r>
+    </w:p>
+    <w:p>
+      <w:pPr>
+        <w:rPr>
+          <w:sz w:val="32"/>
+          <w:szCs w:val="32"/>
+        </w:rPr>
+      </w:pPr>
+      <w:r>
+        <w:rPr>
+          <w:sz w:val="32"/>
+          <w:szCs w:val="32"/>
+        </w:rPr>
+        <w:t>}</w:t>
+      </w:r>
+    </w:p>
+    <w:p>
+      <w:pPr>
+        <w:rPr>
+          <w:sz w:val="32"/>
+          <w:szCs w:val="32"/>
+        </w:rPr>
+      </w:pPr>
+      <w:r>
+        <w:rPr>
+          <w:sz w:val="32"/>
+          <w:szCs w:val="32"/>
+        </w:rPr>
+        <w:t>Matching happens like this:</w:t>
+      </w:r>
+    </w:p>
+    <w:p>
+      <w:pPr>
+        <w:rPr>
+          <w:sz w:val="32"/>
+          <w:szCs w:val="32"/>
+        </w:rPr>
+      </w:pPr>
+      <w:r>
+        <w:rPr>
+          <w:sz w:val="32"/>
+          <w:szCs w:val="32"/>
+        </w:rPr>
+        <w:t>POST /users/101</w:t>
+      </w:r>
+    </w:p>
+    <w:p>
+      <w:pPr>
+        <w:rPr>
+          <w:sz w:val="32"/>
+          <w:szCs w:val="32"/>
+        </w:rPr>
+      </w:pPr>
+      <w:r>
+        <w:rPr>
+          <w:sz w:val="32"/>
+          <w:szCs w:val="32"/>
+        </w:rPr>
+        <w:t xml:space="preserve">      ↓</w:t>
+      </w:r>
+    </w:p>
+    <w:p>
+      <w:pPr>
+        <w:rPr>
+          <w:sz w:val="32"/>
+          <w:szCs w:val="32"/>
+        </w:rPr>
+      </w:pPr>
+      <w:r>
+        <w:rPr>
+          <w:sz w:val="32"/>
+          <w:szCs w:val="32"/>
+        </w:rPr>
+        <w:t>@RestController</w:t>
+      </w:r>
+    </w:p>
+    <w:p>
+      <w:pPr>
+        <w:rPr>
+          <w:sz w:val="32"/>
+          <w:szCs w:val="32"/>
+        </w:rPr>
+      </w:pPr>
+      <w:r>
+        <w:rPr>
+          <w:sz w:val="32"/>
+          <w:szCs w:val="32"/>
+        </w:rPr>
+        <w:t>@RequestMapping("/users")</w:t>
+      </w:r>
+    </w:p>
+    <w:p>
+      <w:pPr>
+        <w:rPr>
+          <w:sz w:val="32"/>
+          <w:szCs w:val="32"/>
+        </w:rPr>
+      </w:pPr>
+      <w:r>
+        <w:rPr>
+          <w:sz w:val="32"/>
+          <w:szCs w:val="32"/>
+        </w:rPr>
+        <w:t>@PostMapping("/{id}")</w:t>
+      </w:r>
+    </w:p>
+    <w:p>
+      <w:pPr>
+        <w:rPr>
+          <w:sz w:val="32"/>
+          <w:szCs w:val="32"/>
+        </w:rPr>
+      </w:pPr>
+      <w:proofErr w:type="gramStart"/>
+      <w:r>
+        <w:rPr>
+          <w:sz w:val="32"/>
+          <w:szCs w:val="32"/>
+        </w:rPr>
+        <w:t>So</w:t>
+      </w:r>
+      <w:proofErr w:type="gramEnd"/>
+      <w:r>
+        <w:rPr>
+          <w:sz w:val="32"/>
+          <w:szCs w:val="32"/>
+        </w:rPr>
+        <w:t xml:space="preserve"> this method is invoked.</w:t>
+      </w:r>
+    </w:p>
+    <w:p>
+      <w:pPr>
+        <w:rPr>
+          <w:sz w:val="32"/>
+          <w:szCs w:val="32"/>
+        </w:rPr>
+      </w:pPr>
+      <w:r>
+        <w:rPr>
+          <w:b/>
+          <w:bCs/>
+          <w:sz w:val="32"/>
+          <w:szCs w:val="32"/>
+        </w:rPr>
+        <w:t>Important:</w:t>
+      </w:r>
+      <w:r>
+        <w:rPr>
+          <w:sz w:val="32"/>
+          <w:szCs w:val="32"/>
+        </w:rPr>
+        <w:br/>
+        <w:t xml:space="preserve">Spring selects the method </w:t>
+      </w:r>
+      <w:r>
+        <w:rPr>
+          <w:b/>
+          <w:bCs/>
+          <w:sz w:val="32"/>
+          <w:szCs w:val="32"/>
+        </w:rPr>
+        <w:t>before even thinking about parameters</w:t>
+      </w:r>
+      <w:r>
+        <w:rPr>
+          <w:sz w:val="32"/>
+          <w:szCs w:val="32"/>
+        </w:rPr>
+        <w:t>.</w:t>
+      </w:r>
+    </w:p>
+    <w:p>
+      <w:pPr>
+        <w:rPr>
+          <w:sz w:val="32"/>
+          <w:szCs w:val="32"/>
+        </w:rPr>
+      </w:pPr>
+      <w:r>
+        <w:rPr>
+          <w:sz w:val="32"/>
+          <w:szCs w:val="32"/>
+        </w:rPr>
+        <w:pict w14:anchorId="326748F8">
+          <v:rect id="_x0000_i1094" style="width:0;height:1.5pt" o:hralign="center" o:hrstd="t" o:hr="t" fillcolor="#a0a0a0" stroked="f"/>
+        </w:pict>
+      </w:r>
+    </w:p>
+    <w:p>
+      <w:pPr>
+        <w:rPr>
+          <w:b/>
+          <w:bCs/>
+          <w:sz w:val="32"/>
+          <w:szCs w:val="32"/>
+        </w:rPr>
+      </w:pPr>
+      <w:r>
+        <w:rPr>
+          <w:b/>
+          <w:bCs/>
+          <w:sz w:val="32"/>
+          <w:szCs w:val="32"/>
+        </w:rPr>
+        <w:t>2️</w:t>
+      </w:r>
+      <w:r>
+        <w:rPr>
+          <w:rFonts w:ascii="Segoe UI Symbol" w:hAnsi="Segoe UI Symbol" w:cs="Segoe UI Symbol"/>
+          <w:b/>
+          <w:bCs/>
+          <w:sz w:val="32"/>
+          <w:szCs w:val="32"/>
+        </w:rPr>
+        <w:t>⃣</w:t>
+      </w:r>
+      <w:r>
+        <w:rPr>
+          <w:b/>
+          <w:bCs/>
+          <w:sz w:val="32"/>
+          <w:szCs w:val="32"/>
+        </w:rPr>
+        <w:t xml:space="preserve"> What are the essential parameters for a method?</w:t>
+      </w:r>
+    </w:p>
+    <w:p>
+      <w:pPr>
+        <w:rPr>
+          <w:sz w:val="32"/>
+          <w:szCs w:val="32"/>
+        </w:rPr>
+      </w:pPr>
+      <w:proofErr w:type="gramStart"/>
+      <w:r>
+        <w:rPr>
+          <w:sz w:val="32"/>
+          <w:szCs w:val="32"/>
+        </w:rPr>
+        <w:t>Actually</w:t>
+      </w:r>
+      <w:proofErr w:type="gramEnd"/>
+      <w:r>
+        <w:rPr>
+          <w:sz w:val="32"/>
+          <w:szCs w:val="32"/>
+        </w:rPr>
+        <w:t xml:space="preserve"> </w:t>
+      </w:r>
+      <w:r>
+        <w:rPr>
+          <w:b/>
+          <w:bCs/>
+          <w:sz w:val="32"/>
+          <w:szCs w:val="32"/>
+        </w:rPr>
+        <w:t>none are strictly required</w:t>
+      </w:r>
+      <w:r>
+        <w:rPr>
+          <w:sz w:val="32"/>
+          <w:szCs w:val="32"/>
+        </w:rPr>
+        <w:t>.</w:t>
+      </w:r>
+    </w:p>
+    <w:p>
+      <w:pPr>
+        <w:rPr>
+          <w:sz w:val="32"/>
+          <w:szCs w:val="32"/>
+        </w:rPr>
+      </w:pPr>
+      <w:r>
+        <w:rPr>
+          <w:sz w:val="32"/>
+          <w:szCs w:val="32"/>
+        </w:rPr>
+        <w:t>This is a valid controller:</w:t>
+      </w:r>
+    </w:p>
+    <w:p>
+      <w:pPr>
+        <w:rPr>
+          <w:sz w:val="32"/>
+          <w:szCs w:val="32"/>
+        </w:rPr>
+      </w:pPr>
+      <w:r>
+        <w:rPr>
+          <w:sz w:val="32"/>
+          <w:szCs w:val="32"/>
+        </w:rPr>
+        <w:t>@PostMapping("/ping")</w:t>
+      </w:r>
+    </w:p>
+    <w:p>
+      <w:pPr>
+        <w:rPr>
+          <w:sz w:val="32"/>
+          <w:szCs w:val="32"/>
+        </w:rPr>
+      </w:pPr>
+      <w:r>
+        <w:rPr>
+          <w:sz w:val="32"/>
+          <w:szCs w:val="32"/>
+        </w:rPr>
+        <w:t xml:space="preserve">public String </w:t>
+      </w:r>
+      <w:proofErr w:type="gramStart"/>
+      <w:r>
+        <w:rPr>
+          <w:sz w:val="32"/>
+          <w:szCs w:val="32"/>
+        </w:rPr>
+        <w:t>ping(</w:t>
+      </w:r>
+      <w:proofErr w:type="gramEnd"/>
+      <w:r>
+        <w:rPr>
+          <w:sz w:val="32"/>
+          <w:szCs w:val="32"/>
+        </w:rPr>
+        <w:t>) {</w:t>
+      </w:r>
+    </w:p>
+    <w:p>
+      <w:pPr>
+        <w:rPr>
+          <w:sz w:val="32"/>
+          <w:szCs w:val="32"/>
+        </w:rPr>
+      </w:pPr>
+      <w:r>
+        <w:rPr>
+          <w:sz w:val="32"/>
+          <w:szCs w:val="32"/>
+        </w:rPr>
+        <w:t xml:space="preserve">    return "ok";</w:t>
+      </w:r>
+    </w:p>
+    <w:p>
+      <w:pPr>
+        <w:rPr>
+          <w:sz w:val="32"/>
+          <w:szCs w:val="32"/>
+        </w:rPr>
+      </w:pPr>
+      <w:r>
+        <w:rPr>
+          <w:sz w:val="32"/>
+          <w:szCs w:val="32"/>
+        </w:rPr>
+        <w:t>}</w:t>
+      </w:r>
+    </w:p>
+    <w:p>
+      <w:pPr>
+        <w:rPr>
+          <w:sz w:val="32"/>
+          <w:szCs w:val="32"/>
+        </w:rPr>
+      </w:pPr>
+      <w:r>
+        <w:rPr>
+          <w:sz w:val="32"/>
+          <w:szCs w:val="32"/>
+        </w:rPr>
+        <w:lastRenderedPageBreak/>
+        <w:t>Client request:</w:t>
+      </w:r>
+    </w:p>
+    <w:p>
+      <w:pPr>
+        <w:rPr>
+          <w:sz w:val="32"/>
+          <w:szCs w:val="32"/>
+        </w:rPr>
+      </w:pPr>
+      <w:r>
+        <w:rPr>
+          <w:sz w:val="32"/>
+          <w:szCs w:val="32"/>
+        </w:rPr>
+        <w:t>POST /ping</w:t>
+      </w:r>
+    </w:p>
+    <w:p>
+      <w:pPr>
+        <w:rPr>
+          <w:sz w:val="32"/>
+          <w:szCs w:val="32"/>
+        </w:rPr>
+      </w:pPr>
+      <w:r>
+        <w:rPr>
+          <w:sz w:val="32"/>
+          <w:szCs w:val="32"/>
+        </w:rPr>
+        <w:t>Works perfectly.</w:t>
+      </w:r>
+    </w:p>
+    <w:p>
+      <w:pPr>
+        <w:rPr>
+          <w:sz w:val="32"/>
+          <w:szCs w:val="32"/>
+        </w:rPr>
+      </w:pPr>
+      <w:r>
+        <w:rPr>
+          <w:sz w:val="32"/>
+          <w:szCs w:val="32"/>
+        </w:rPr>
+        <w:t xml:space="preserve">Parameters are only needed </w:t>
+      </w:r>
+      <w:r>
+        <w:rPr>
+          <w:b/>
+          <w:bCs/>
+          <w:sz w:val="32"/>
+          <w:szCs w:val="32"/>
+        </w:rPr>
+        <w:t>if the client sends data that you want to read</w:t>
+      </w:r>
+      <w:r>
+        <w:rPr>
+          <w:sz w:val="32"/>
+          <w:szCs w:val="32"/>
+        </w:rPr>
+        <w:t>.</w:t>
+      </w:r>
+    </w:p>
+    <w:p>
+      <w:pPr>
+        <w:rPr>
+          <w:sz w:val="32"/>
+          <w:szCs w:val="32"/>
+        </w:rPr>
+      </w:pPr>
+      <w:r>
+        <w:rPr>
+          <w:sz w:val="32"/>
+          <w:szCs w:val="32"/>
+        </w:rPr>
+        <w:pict w14:anchorId="3F671BF9">
+          <v:rect id="_x0000_i1095" style="width:0;height:1.5pt" o:hralign="center" o:hrstd="t" o:hr="t" fillcolor="#a0a0a0" stroked="f"/>
+        </w:pict>
+      </w:r>
+    </w:p>
+    <w:p>
+      <w:pPr>
+        <w:rPr>
+          <w:b/>
+          <w:bCs/>
+          <w:sz w:val="32"/>
+          <w:szCs w:val="32"/>
+        </w:rPr>
+      </w:pPr>
+      <w:r>
+        <w:rPr>
+          <w:b/>
+          <w:bCs/>
+          <w:sz w:val="32"/>
+          <w:szCs w:val="32"/>
+        </w:rPr>
+        <w:t>3️</w:t>
+      </w:r>
+      <w:r>
+        <w:rPr>
+          <w:rFonts w:ascii="Segoe UI Symbol" w:hAnsi="Segoe UI Symbol" w:cs="Segoe UI Symbol"/>
+          <w:b/>
+          <w:bCs/>
+          <w:sz w:val="32"/>
+          <w:szCs w:val="32"/>
+        </w:rPr>
+        <w:t>⃣</w:t>
+      </w:r>
+      <w:r>
+        <w:rPr>
+          <w:b/>
+          <w:bCs/>
+          <w:sz w:val="32"/>
+          <w:szCs w:val="32"/>
+        </w:rPr>
+        <w:t xml:space="preserve"> How client decides what data to send</w:t>
+      </w:r>
+    </w:p>
+    <w:p>
+      <w:pPr>
+        <w:rPr>
+          <w:sz w:val="32"/>
+          <w:szCs w:val="32"/>
+        </w:rPr>
+      </w:pPr>
+      <w:r>
+        <w:rPr>
+          <w:sz w:val="32"/>
+          <w:szCs w:val="32"/>
+        </w:rPr>
+        <w:t xml:space="preserve">Clients send data using </w:t>
+      </w:r>
+      <w:r>
+        <w:rPr>
+          <w:b/>
+          <w:bCs/>
+          <w:sz w:val="32"/>
+          <w:szCs w:val="32"/>
+        </w:rPr>
+        <w:t>HTTP request structure</w:t>
+      </w:r>
+      <w:r>
+        <w:rPr>
+          <w:sz w:val="32"/>
+          <w:szCs w:val="32"/>
+        </w:rPr>
+        <w:t>.</w:t>
+      </w:r>
+    </w:p>
+    <w:p>
+      <w:pPr>
+        <w:rPr>
+          <w:sz w:val="32"/>
+          <w:szCs w:val="32"/>
+        </w:rPr>
+      </w:pPr>
+      <w:r>
+        <w:rPr>
+          <w:sz w:val="32"/>
+          <w:szCs w:val="32"/>
+        </w:rPr>
+        <w:t xml:space="preserve">An HTTP request has </w:t>
+      </w:r>
+      <w:r>
+        <w:rPr>
+          <w:b/>
+          <w:bCs/>
+          <w:sz w:val="32"/>
+          <w:szCs w:val="32"/>
+        </w:rPr>
+        <w:t>four places where data can exist</w:t>
+      </w:r>
+      <w:r>
+        <w:rPr>
+          <w:sz w:val="32"/>
+          <w:szCs w:val="32"/>
+        </w:rPr>
+        <w:t>.</w:t>
+      </w:r>
+    </w:p>
+    <w:p>
+      <w:pPr>
+        <w:rPr>
+          <w:sz w:val="32"/>
+          <w:szCs w:val="32"/>
+        </w:rPr>
+      </w:pPr>
+      <w:r>
+        <w:rPr>
+          <w:sz w:val="32"/>
+          <w:szCs w:val="32"/>
+        </w:rPr>
+        <w:t>HTTP Request</w:t>
+      </w:r>
+    </w:p>
+    <w:p>
+      <w:pPr>
+        <w:rPr>
+          <w:sz w:val="32"/>
+          <w:szCs w:val="32"/>
+        </w:rPr>
+      </w:pPr>
+      <w:r>
+        <w:rPr>
+          <w:sz w:val="32"/>
+          <w:szCs w:val="32"/>
+        </w:rPr>
+        <w:t xml:space="preserve"> </w:t>
+      </w:r>
+      <w:r>
+        <w:rPr>
+          <w:rFonts w:ascii="MS Gothic" w:eastAsia="MS Gothic" w:hAnsi="MS Gothic" w:cs="MS Gothic" w:hint="eastAsia"/>
+          <w:sz w:val="32"/>
+          <w:szCs w:val="32"/>
+        </w:rPr>
+        <w:t>├</w:t>
+      </w:r>
+      <w:r>
+        <w:rPr>
+          <w:rFonts w:ascii="Calibri" w:hAnsi="Calibri" w:cs="Calibri"/>
+          <w:sz w:val="32"/>
+          <w:szCs w:val="32"/>
+        </w:rPr>
+        <w:t>─</w:t>
+      </w:r>
+      <w:r>
+        <w:rPr>
+          <w:sz w:val="32"/>
+          <w:szCs w:val="32"/>
+        </w:rPr>
+        <w:t xml:space="preserve"> URL path</w:t>
+      </w:r>
+    </w:p>
+    <w:p>
+      <w:pPr>
+        <w:rPr>
+          <w:sz w:val="32"/>
+          <w:szCs w:val="32"/>
+        </w:rPr>
+      </w:pPr>
+      <w:r>
+        <w:rPr>
+          <w:sz w:val="32"/>
+          <w:szCs w:val="32"/>
+        </w:rPr>
+        <w:t xml:space="preserve"> </w:t>
+      </w:r>
+      <w:r>
+        <w:rPr>
+          <w:rFonts w:ascii="MS Gothic" w:eastAsia="MS Gothic" w:hAnsi="MS Gothic" w:cs="MS Gothic" w:hint="eastAsia"/>
+          <w:sz w:val="32"/>
+          <w:szCs w:val="32"/>
+        </w:rPr>
+        <w:t>├</w:t>
+      </w:r>
+      <w:r>
+        <w:rPr>
+          <w:rFonts w:ascii="Calibri" w:hAnsi="Calibri" w:cs="Calibri"/>
+          <w:sz w:val="32"/>
+          <w:szCs w:val="32"/>
+        </w:rPr>
+        <w:t>─</w:t>
+      </w:r>
+      <w:r>
+        <w:rPr>
+          <w:sz w:val="32"/>
+          <w:szCs w:val="32"/>
+        </w:rPr>
+        <w:t xml:space="preserve"> Query parameters</w:t>
+      </w:r>
+    </w:p>
+    <w:p>
+      <w:pPr>
+        <w:rPr>
+          <w:sz w:val="32"/>
+          <w:szCs w:val="32"/>
+        </w:rPr>
+      </w:pPr>
+      <w:r>
+        <w:rPr>
+          <w:sz w:val="32"/>
+          <w:szCs w:val="32"/>
+        </w:rPr>
+        <w:t xml:space="preserve"> </w:t>
+      </w:r>
+      <w:r>
+        <w:rPr>
+          <w:rFonts w:ascii="MS Gothic" w:eastAsia="MS Gothic" w:hAnsi="MS Gothic" w:cs="MS Gothic" w:hint="eastAsia"/>
+          <w:sz w:val="32"/>
+          <w:szCs w:val="32"/>
+        </w:rPr>
+        <w:t>├</w:t>
+      </w:r>
+      <w:r>
+        <w:rPr>
+          <w:rFonts w:ascii="Calibri" w:hAnsi="Calibri" w:cs="Calibri"/>
+          <w:sz w:val="32"/>
+          <w:szCs w:val="32"/>
+        </w:rPr>
+        <w:t>─</w:t>
+      </w:r>
+      <w:r>
+        <w:rPr>
+          <w:sz w:val="32"/>
+          <w:szCs w:val="32"/>
+        </w:rPr>
+        <w:t xml:space="preserve"> Headers</w:t>
+      </w:r>
+    </w:p>
+    <w:p>
+      <w:pPr>
+        <w:rPr>
+          <w:sz w:val="32"/>
+          <w:szCs w:val="32"/>
+        </w:rPr>
+      </w:pPr>
+      <w:r>
+        <w:rPr>
+          <w:sz w:val="32"/>
+          <w:szCs w:val="32"/>
+        </w:rPr>
+        <w:t xml:space="preserve"> └─ Body</w:t>
+      </w:r>
+    </w:p>
+    <w:p>
+      <w:pPr>
+        <w:rPr>
+          <w:sz w:val="32"/>
+          <w:szCs w:val="32"/>
+        </w:rPr>
+      </w:pPr>
+      <w:r>
+        <w:rPr>
+          <w:sz w:val="32"/>
+          <w:szCs w:val="32"/>
+        </w:rPr>
+        <w:t>Example request:</w:t>
+      </w:r>
+    </w:p>
+    <w:p>
+      <w:pPr>
+        <w:rPr>
+          <w:sz w:val="32"/>
+          <w:szCs w:val="32"/>
+        </w:rPr>
+      </w:pPr>
+      <w:r>
+        <w:rPr>
+          <w:sz w:val="32"/>
+          <w:szCs w:val="32"/>
+        </w:rPr>
+        <w:t>POST /users/101?active=true</w:t>
+      </w:r>
+    </w:p>
+    <w:p>
+      <w:pPr>
+        <w:rPr>
+          <w:sz w:val="32"/>
+          <w:szCs w:val="32"/>
+        </w:rPr>
+      </w:pPr>
+      <w:r>
+        <w:rPr>
+          <w:sz w:val="32"/>
+          <w:szCs w:val="32"/>
+        </w:rPr>
+        <w:t>Header: token=abc123</w:t>
+      </w:r>
+    </w:p>
+    <w:p>
+      <w:pPr>
+        <w:rPr>
+          <w:sz w:val="32"/>
+          <w:szCs w:val="32"/>
+        </w:rPr>
+      </w:pPr>
+      <w:r>
+        <w:rPr>
+          <w:sz w:val="32"/>
+          <w:szCs w:val="32"/>
+        </w:rPr>
+        <w:t>Body:</w:t>
+      </w:r>
+    </w:p>
+    <w:p>
+      <w:pPr>
+        <w:rPr>
+          <w:sz w:val="32"/>
+          <w:szCs w:val="32"/>
+        </w:rPr>
+      </w:pPr>
+      <w:r>
+        <w:rPr>
+          <w:sz w:val="32"/>
+          <w:szCs w:val="32"/>
+        </w:rPr>
+        <w:t>{</w:t>
+      </w:r>
+    </w:p>
+    <w:p>
+      <w:pPr>
+        <w:rPr>
+          <w:sz w:val="32"/>
+          <w:szCs w:val="32"/>
+        </w:rPr>
+      </w:pPr>
+      <w:r>
+        <w:rPr>
+          <w:sz w:val="32"/>
+          <w:szCs w:val="32"/>
+        </w:rPr>
+        <w:t xml:space="preserve"> "name": "John"</w:t>
+      </w:r>
+    </w:p>
+    <w:p>
+      <w:pPr>
+        <w:rPr>
+          <w:sz w:val="32"/>
+          <w:szCs w:val="32"/>
+        </w:rPr>
+      </w:pPr>
+      <w:r>
+        <w:rPr>
+          <w:sz w:val="32"/>
+          <w:szCs w:val="32"/>
+        </w:rPr>
+        <w:t>}</w:t>
+      </w:r>
+    </w:p>
+    <w:p>
+      <w:pPr>
+        <w:rPr>
+          <w:sz w:val="32"/>
+          <w:szCs w:val="32"/>
+        </w:rPr>
+      </w:pPr>
+      <w:r>
+        <w:rPr>
+          <w:sz w:val="32"/>
+          <w:szCs w:val="32"/>
+        </w:rPr>
+        <w:t xml:space="preserve">Here the client sent data in </w:t>
+      </w:r>
+      <w:r>
+        <w:rPr>
+          <w:b/>
+          <w:bCs/>
+          <w:sz w:val="32"/>
+          <w:szCs w:val="32"/>
+        </w:rPr>
+        <w:t>4 places</w:t>
+      </w:r>
+      <w:r>
+        <w:rPr>
+          <w:sz w:val="32"/>
+          <w:szCs w:val="32"/>
+        </w:rPr>
+        <w:t>.</w:t>
+      </w:r>
+    </w:p>
+    <w:tbl>
+      <w:tblPr>
+        <w:tblW w:w="0" w:type="auto"/>
+        <w:tblCellSpacing w:w="15" w:type="dxa"/>
+        <w:tblCellMar>
+          <w:top w:w="15" w:type="dxa"/>
+          <w:left w:w="15" w:type="dxa"/>
+          <w:bottom w:w="15" w:type="dxa"/>
+          <w:right w:w="15" w:type="dxa"/>
+        </w:tblCellMar>
+        <w:tblLook w:val="04A0" w:firstRow="1" w:lastRow="0" w:firstColumn="1" w:lastColumn="0" w:noHBand="0" w:noVBand="1"/>
+      </w:tblPr>
+      <w:tblGrid>
+        <w:gridCol w:w="1784"/>
+        <w:gridCol w:w="1898"/>
+        <w:gridCol w:w="3027"/>
+      </w:tblGrid>
+      <w:tr>
+        <w:trPr>
+          <w:tblHeader/>
+          <w:tblCellSpacing w:w="15" w:type="dxa"/>
+        </w:trPr>
+        <w:tc>
+          <w:tcPr>
+            <w:tcW w:w="0" w:type="auto"/>
+            <w:vAlign w:val="center"/>
+            <w:hideMark/>
+          </w:tcPr>
+          <w:p>
+            <w:pPr>
+              <w:rPr>
+                <w:b/>
+                <w:bCs/>
+                <w:sz w:val="32"/>
+                <w:szCs w:val="32"/>
+              </w:rPr>
+            </w:pPr>
+            <w:r>
+              <w:rPr>
+                <w:b/>
+                <w:bCs/>
+                <w:sz w:val="32"/>
+                <w:szCs w:val="32"/>
+              </w:rPr>
+              <w:lastRenderedPageBreak/>
+              <w:t>Location</w:t>
+            </w:r>
+          </w:p>
+        </w:tc>
+        <w:tc>
+          <w:tcPr>
+            <w:tcW w:w="0" w:type="auto"/>
+            <w:vAlign w:val="center"/>
+            <w:hideMark/>
+          </w:tcPr>
+          <w:p>
+            <w:pPr>
+              <w:rPr>
+                <w:b/>
+                <w:bCs/>
+                <w:sz w:val="32"/>
+                <w:szCs w:val="32"/>
+              </w:rPr>
+            </w:pPr>
+            <w:r>
+              <w:rPr>
+                <w:b/>
+                <w:bCs/>
+                <w:sz w:val="32"/>
+                <w:szCs w:val="32"/>
+              </w:rPr>
+              <w:t>Example</w:t>
+            </w:r>
+          </w:p>
+        </w:tc>
+        <w:tc>
+          <w:tcPr>
+            <w:tcW w:w="0" w:type="auto"/>
+            <w:vAlign w:val="center"/>
+            <w:hideMark/>
+          </w:tcPr>
+          <w:p>
+            <w:pPr>
+              <w:rPr>
+                <w:b/>
+                <w:bCs/>
+                <w:sz w:val="32"/>
+                <w:szCs w:val="32"/>
+              </w:rPr>
+            </w:pPr>
+            <w:r>
+              <w:rPr>
+                <w:b/>
+                <w:bCs/>
+                <w:sz w:val="32"/>
+                <w:szCs w:val="32"/>
+              </w:rPr>
+              <w:t>How backend receives</w:t>
+            </w:r>
+          </w:p>
+        </w:tc>
+      </w:tr>
+      <w:tr>
+        <w:trPr>
+          <w:tblCellSpacing w:w="15" w:type="dxa"/>
+        </w:trPr>
+        <w:tc>
+          <w:tcPr>
+            <w:tcW w:w="0" w:type="auto"/>
+            <w:vAlign w:val="center"/>
+            <w:hideMark/>
+          </w:tcPr>
+          <w:p>
+            <w:pPr>
+              <w:rPr>
+                <w:sz w:val="32"/>
+                <w:szCs w:val="32"/>
+              </w:rPr>
+            </w:pPr>
+            <w:r>
+              <w:rPr>
+                <w:sz w:val="32"/>
+                <w:szCs w:val="32"/>
+              </w:rPr>
+              <w:t>Path</w:t>
+            </w:r>
+          </w:p>
+        </w:tc>
+        <w:tc>
+          <w:tcPr>
+            <w:tcW w:w="0" w:type="auto"/>
+            <w:vAlign w:val="center"/>
+            <w:hideMark/>
+          </w:tcPr>
+          <w:p>
+            <w:pPr>
+              <w:rPr>
+                <w:sz w:val="32"/>
+                <w:szCs w:val="32"/>
+              </w:rPr>
+            </w:pPr>
+            <w:r>
+              <w:rPr>
+                <w:sz w:val="32"/>
+                <w:szCs w:val="32"/>
+              </w:rPr>
+              <w:t>/users/101</w:t>
+            </w:r>
+          </w:p>
+        </w:tc>
+        <w:tc>
+          <w:tcPr>
+            <w:tcW w:w="0" w:type="auto"/>
+            <w:vAlign w:val="center"/>
+            <w:hideMark/>
+          </w:tcPr>
+          <w:p>
+            <w:pPr>
+              <w:rPr>
+                <w:sz w:val="32"/>
+                <w:szCs w:val="32"/>
+              </w:rPr>
+            </w:pPr>
+            <w:r>
+              <w:rPr>
+                <w:sz w:val="32"/>
+                <w:szCs w:val="32"/>
+              </w:rPr>
+              <w:t>@PathVariable</w:t>
+            </w:r>
+          </w:p>
+        </w:tc>
+      </w:tr>
+      <w:tr>
+        <w:trPr>
+          <w:tblCellSpacing w:w="15" w:type="dxa"/>
+        </w:trPr>
+        <w:tc>
+          <w:tcPr>
+            <w:tcW w:w="0" w:type="auto"/>
+            <w:vAlign w:val="center"/>
+            <w:hideMark/>
+          </w:tcPr>
+          <w:p>
+            <w:pPr>
+              <w:rPr>
+                <w:sz w:val="32"/>
+                <w:szCs w:val="32"/>
+              </w:rPr>
+            </w:pPr>
+            <w:r>
+              <w:rPr>
+                <w:sz w:val="32"/>
+                <w:szCs w:val="32"/>
+              </w:rPr>
+              <w:t>Query param</w:t>
+            </w:r>
+          </w:p>
+        </w:tc>
+        <w:tc>
+          <w:tcPr>
+            <w:tcW w:w="0" w:type="auto"/>
+            <w:vAlign w:val="center"/>
+            <w:hideMark/>
+          </w:tcPr>
+          <w:p>
+            <w:pPr>
+              <w:rPr>
+                <w:sz w:val="32"/>
+                <w:szCs w:val="32"/>
+              </w:rPr>
+            </w:pPr>
+            <w:r>
+              <w:rPr>
+                <w:sz w:val="32"/>
+                <w:szCs w:val="32"/>
+              </w:rPr>
+              <w:t>?active=true</w:t>
+            </w:r>
+          </w:p>
+        </w:tc>
+        <w:tc>
+          <w:tcPr>
+            <w:tcW w:w="0" w:type="auto"/>
+            <w:vAlign w:val="center"/>
+            <w:hideMark/>
+          </w:tcPr>
+          <w:p>
+            <w:pPr>
+              <w:rPr>
+                <w:sz w:val="32"/>
+                <w:szCs w:val="32"/>
+              </w:rPr>
+            </w:pPr>
+            <w:r>
+              <w:rPr>
+                <w:sz w:val="32"/>
+                <w:szCs w:val="32"/>
+              </w:rPr>
+              <w:t>@RequestParam</w:t>
+            </w:r>
+          </w:p>
+        </w:tc>
+      </w:tr>
+      <w:tr>
+        <w:trPr>
+          <w:tblCellSpacing w:w="15" w:type="dxa"/>
+        </w:trPr>
+        <w:tc>
+          <w:tcPr>
+            <w:tcW w:w="0" w:type="auto"/>
+            <w:vAlign w:val="center"/>
+            <w:hideMark/>
+          </w:tcPr>
+          <w:p>
+            <w:pPr>
+              <w:rPr>
+                <w:sz w:val="32"/>
+                <w:szCs w:val="32"/>
+              </w:rPr>
+            </w:pPr>
+            <w:r>
+              <w:rPr>
+                <w:sz w:val="32"/>
+                <w:szCs w:val="32"/>
+              </w:rPr>
+              <w:t>Header</w:t>
+            </w:r>
+          </w:p>
+        </w:tc>
+        <w:tc>
+          <w:tcPr>
+            <w:tcW w:w="0" w:type="auto"/>
+            <w:vAlign w:val="center"/>
+            <w:hideMark/>
+          </w:tcPr>
+          <w:p>
+            <w:pPr>
+              <w:rPr>
+                <w:sz w:val="32"/>
+                <w:szCs w:val="32"/>
+              </w:rPr>
+            </w:pPr>
+            <w:r>
+              <w:rPr>
+                <w:sz w:val="32"/>
+                <w:szCs w:val="32"/>
+              </w:rPr>
+              <w:t>token=abc123</w:t>
+            </w:r>
+          </w:p>
+        </w:tc>
+        <w:tc>
+          <w:tcPr>
+            <w:tcW w:w="0" w:type="auto"/>
+            <w:vAlign w:val="center"/>
+            <w:hideMark/>
+          </w:tcPr>
+          <w:p>
+            <w:pPr>
+              <w:rPr>
+                <w:sz w:val="32"/>
+                <w:szCs w:val="32"/>
+              </w:rPr>
+            </w:pPr>
+            <w:r>
+              <w:rPr>
+                <w:sz w:val="32"/>
+                <w:szCs w:val="32"/>
+              </w:rPr>
+              <w:t>@RequestHeader</w:t>
+            </w:r>
+          </w:p>
+        </w:tc>
+      </w:tr>
+      <w:tr>
+        <w:trPr>
+          <w:tblCellSpacing w:w="15" w:type="dxa"/>
+        </w:trPr>
+        <w:tc>
+          <w:tcPr>
+            <w:tcW w:w="0" w:type="auto"/>
+            <w:vAlign w:val="center"/>
+            <w:hideMark/>
+          </w:tcPr>
+          <w:p>
+            <w:pPr>
+              <w:rPr>
+                <w:sz w:val="32"/>
+                <w:szCs w:val="32"/>
+              </w:rPr>
+            </w:pPr>
+            <w:r>
+              <w:rPr>
+                <w:sz w:val="32"/>
+                <w:szCs w:val="32"/>
+              </w:rPr>
+              <w:t>Body</w:t>
+            </w:r>
+          </w:p>
+        </w:tc>
+        <w:tc>
+          <w:tcPr>
+            <w:tcW w:w="0" w:type="auto"/>
+            <w:vAlign w:val="center"/>
+            <w:hideMark/>
+          </w:tcPr>
+          <w:p>
+            <w:pPr>
+              <w:rPr>
+                <w:sz w:val="32"/>
+                <w:szCs w:val="32"/>
+              </w:rPr>
+            </w:pPr>
+            <w:r>
+              <w:rPr>
+                <w:sz w:val="32"/>
+                <w:szCs w:val="32"/>
+              </w:rPr>
+              <w:t>JSON</w:t>
+            </w:r>
+          </w:p>
+        </w:tc>
+        <w:tc>
+          <w:tcPr>
+            <w:tcW w:w="0" w:type="auto"/>
+            <w:vAlign w:val="center"/>
+            <w:hideMark/>
+          </w:tcPr>
+          <w:p>
+            <w:pPr>
+              <w:rPr>
+                <w:sz w:val="32"/>
+                <w:szCs w:val="32"/>
+              </w:rPr>
+            </w:pPr>
+            <w:r>
+              <w:rPr>
+                <w:sz w:val="32"/>
+                <w:szCs w:val="32"/>
+              </w:rPr>
+              <w:t>@RequestBody</w:t>
+            </w:r>
+          </w:p>
+        </w:tc>
+      </w:tr>
+    </w:tbl>
+    <w:p>
+      <w:pPr>
+        <w:rPr>
+          <w:sz w:val="32"/>
+          <w:szCs w:val="32"/>
+        </w:rPr>
+      </w:pPr>
+      <w:r>
+        <w:rPr>
+          <w:sz w:val="32"/>
+          <w:szCs w:val="32"/>
+        </w:rPr>
+        <w:t xml:space="preserve">These annotations are simply </w:t>
+      </w:r>
+      <w:r>
+        <w:rPr>
+          <w:b/>
+          <w:bCs/>
+          <w:sz w:val="32"/>
+          <w:szCs w:val="32"/>
+        </w:rPr>
+        <w:t>tools to read data from those places</w:t>
+      </w:r>
+      <w:r>
+        <w:rPr>
+          <w:sz w:val="32"/>
+          <w:szCs w:val="32"/>
+        </w:rPr>
+        <w:t>.</w:t>
+      </w:r>
+    </w:p>
+    <w:p>
+      <w:pPr>
+        <w:rPr>
+          <w:sz w:val="32"/>
+          <w:szCs w:val="32"/>
+        </w:rPr>
+      </w:pPr>
+      <w:r>
+        <w:rPr>
+          <w:sz w:val="32"/>
+          <w:szCs w:val="32"/>
+        </w:rPr>
+        <w:pict w14:anchorId="71A9088B">
+          <v:rect id="_x0000_i1096" style="width:0;height:1.5pt" o:hralign="center" o:hrstd="t" o:hr="t" fillcolor="#a0a0a0" stroked="f"/>
+        </w:pict>
+      </w:r>
+    </w:p>
+    <w:p>
+      <w:pPr>
+        <w:rPr>
+          <w:b/>
+          <w:bCs/>
+          <w:sz w:val="32"/>
+          <w:szCs w:val="32"/>
+        </w:rPr>
+      </w:pPr>
+      <w:r>
+        <w:rPr>
+          <w:b/>
+          <w:bCs/>
+          <w:sz w:val="32"/>
+          <w:szCs w:val="32"/>
+        </w:rPr>
+        <w:t>4️</w:t>
+      </w:r>
+      <w:r>
+        <w:rPr>
+          <w:rFonts w:ascii="Segoe UI Symbol" w:hAnsi="Segoe UI Symbol" w:cs="Segoe UI Symbol"/>
+          <w:b/>
+          <w:bCs/>
+          <w:sz w:val="32"/>
+          <w:szCs w:val="32"/>
+        </w:rPr>
+        <w:t>⃣</w:t>
+      </w:r>
+      <w:r>
+        <w:rPr>
+          <w:b/>
+          <w:bCs/>
+          <w:sz w:val="32"/>
+          <w:szCs w:val="32"/>
+        </w:rPr>
+        <w:t xml:space="preserve"> How do we decide what client should send?</w:t>
+      </w:r>
+    </w:p>
+    <w:p>
+      <w:pPr>
+        <w:rPr>
+          <w:sz w:val="32"/>
+          <w:szCs w:val="32"/>
+        </w:rPr>
+      </w:pPr>
+      <w:r>
+        <w:rPr>
+          <w:sz w:val="32"/>
+          <w:szCs w:val="32"/>
+        </w:rPr>
+        <w:t xml:space="preserve">This is </w:t>
+      </w:r>
+      <w:r>
+        <w:rPr>
+          <w:b/>
+          <w:bCs/>
+          <w:sz w:val="32"/>
+          <w:szCs w:val="32"/>
+        </w:rPr>
+        <w:t>decided by the API design</w:t>
+      </w:r>
+      <w:r>
+        <w:rPr>
+          <w:sz w:val="32"/>
+          <w:szCs w:val="32"/>
+        </w:rPr>
+        <w:t>.</w:t>
+      </w:r>
+    </w:p>
+    <w:p>
+      <w:pPr>
+        <w:rPr>
+          <w:sz w:val="32"/>
+          <w:szCs w:val="32"/>
+        </w:rPr>
+      </w:pPr>
+      <w:r>
+        <w:rPr>
+          <w:sz w:val="32"/>
+          <w:szCs w:val="32"/>
+        </w:rPr>
+        <w:t>Example API design:</w:t>
+      </w:r>
+    </w:p>
+    <w:p>
+      <w:pPr>
+        <w:rPr>
+          <w:sz w:val="32"/>
+          <w:szCs w:val="32"/>
+        </w:rPr>
+      </w:pPr>
+      <w:r>
+        <w:rPr>
+          <w:sz w:val="32"/>
+          <w:szCs w:val="32"/>
+        </w:rPr>
+        <w:t>POST /users/{</w:t>
+      </w:r>
+      <w:proofErr w:type="spellStart"/>
+      <w:r>
+        <w:rPr>
+          <w:sz w:val="32"/>
+          <w:szCs w:val="32"/>
+        </w:rPr>
+        <w:t>userId</w:t>
+      </w:r>
+      <w:proofErr w:type="spellEnd"/>
+      <w:r>
+        <w:rPr>
+          <w:sz w:val="32"/>
+          <w:szCs w:val="32"/>
+        </w:rPr>
+        <w:t>}</w:t>
+      </w:r>
+    </w:p>
+    <w:p>
+      <w:pPr>
+        <w:rPr>
+          <w:sz w:val="32"/>
+          <w:szCs w:val="32"/>
+        </w:rPr>
+      </w:pPr>
+      <w:r>
+        <w:rPr>
+          <w:sz w:val="32"/>
+          <w:szCs w:val="32"/>
+        </w:rPr>
+        <w:t>Body:</w:t>
+      </w:r>
+    </w:p>
+    <w:p>
+      <w:pPr>
+        <w:rPr>
+          <w:sz w:val="32"/>
+          <w:szCs w:val="32"/>
+        </w:rPr>
+      </w:pPr>
+      <w:r>
+        <w:rPr>
+          <w:sz w:val="32"/>
+          <w:szCs w:val="32"/>
+        </w:rPr>
+        <w:t>{</w:t>
+      </w:r>
+    </w:p>
+    <w:p>
+      <w:pPr>
+        <w:rPr>
+          <w:sz w:val="32"/>
+          <w:szCs w:val="32"/>
+        </w:rPr>
+      </w:pPr>
+      <w:r>
+        <w:rPr>
+          <w:sz w:val="32"/>
+          <w:szCs w:val="32"/>
+        </w:rPr>
+        <w:t xml:space="preserve"> "name": "John",</w:t>
+      </w:r>
+    </w:p>
+    <w:p>
+      <w:pPr>
+        <w:rPr>
+          <w:sz w:val="32"/>
+          <w:szCs w:val="32"/>
+        </w:rPr>
+      </w:pPr>
+      <w:r>
+        <w:rPr>
+          <w:sz w:val="32"/>
+          <w:szCs w:val="32"/>
+        </w:rPr>
+        <w:t xml:space="preserve"> "age": 25</w:t>
+      </w:r>
+    </w:p>
+    <w:p>
+      <w:pPr>
+        <w:rPr>
+          <w:sz w:val="32"/>
+          <w:szCs w:val="32"/>
+        </w:rPr>
+      </w:pPr>
+      <w:r>
+        <w:rPr>
+          <w:sz w:val="32"/>
+          <w:szCs w:val="32"/>
+        </w:rPr>
+        <w:t>}</w:t>
+      </w:r>
+    </w:p>
+    <w:p>
+      <w:pPr>
+        <w:rPr>
+          <w:sz w:val="32"/>
+          <w:szCs w:val="32"/>
+        </w:rPr>
+      </w:pPr>
+      <w:r>
+        <w:rPr>
+          <w:sz w:val="32"/>
+          <w:szCs w:val="32"/>
+        </w:rPr>
+        <w:t>Because we designed the API like that, the client must send:</w:t>
+      </w:r>
+    </w:p>
+    <w:p>
+      <w:pPr>
+        <w:numPr>
+          <w:ilvl w:val="0"/>
+          <w:numId w:val="18"/>
+        </w:numPr>
+        <w:rPr>
+          <w:sz w:val="32"/>
+          <w:szCs w:val="32"/>
+        </w:rPr>
+      </w:pPr>
+      <w:proofErr w:type="spellStart"/>
+      <w:r>
+        <w:rPr>
+          <w:sz w:val="32"/>
+          <w:szCs w:val="32"/>
+        </w:rPr>
+        <w:t>userId</w:t>
+      </w:r>
+      <w:proofErr w:type="spellEnd"/>
+      <w:r>
+        <w:rPr>
+          <w:sz w:val="32"/>
+          <w:szCs w:val="32"/>
+        </w:rPr>
+        <w:t xml:space="preserve"> in URL</w:t>
+      </w:r>
+    </w:p>
+    <w:p>
+      <w:pPr>
+        <w:numPr>
+          <w:ilvl w:val="0"/>
+          <w:numId w:val="18"/>
+        </w:numPr>
+        <w:rPr>
+          <w:sz w:val="32"/>
+          <w:szCs w:val="32"/>
+        </w:rPr>
+      </w:pPr>
+      <w:r>
+        <w:rPr>
+          <w:sz w:val="32"/>
+          <w:szCs w:val="32"/>
+        </w:rPr>
+        <w:t>user info in body</w:t>
+      </w:r>
+    </w:p>
+    <w:p>
+      <w:pPr>
+        <w:rPr>
+          <w:sz w:val="32"/>
+          <w:szCs w:val="32"/>
+        </w:rPr>
+      </w:pPr>
+      <w:r>
+        <w:rPr>
+          <w:sz w:val="32"/>
+          <w:szCs w:val="32"/>
+        </w:rPr>
+        <w:t>Controller:</w:t>
+      </w:r>
+    </w:p>
+    <w:p>
+      <w:pPr>
+        <w:rPr>
+          <w:sz w:val="32"/>
+          <w:szCs w:val="32"/>
+        </w:rPr>
+      </w:pPr>
+      <w:r>
+        <w:rPr>
+          <w:sz w:val="32"/>
+          <w:szCs w:val="32"/>
+        </w:rPr>
+        <w:t>@PostMapping("/users/{userId}")</w:t>
+      </w:r>
+    </w:p>
+    <w:p>
+      <w:pPr>
+        <w:rPr>
+          <w:sz w:val="32"/>
+          <w:szCs w:val="32"/>
+        </w:rPr>
+      </w:pPr>
+      <w:r>
+        <w:rPr>
+          <w:sz w:val="32"/>
+          <w:szCs w:val="32"/>
+        </w:rPr>
+        <w:t xml:space="preserve">public User </w:t>
+      </w:r>
+      <w:proofErr w:type="spellStart"/>
+      <w:proofErr w:type="gramStart"/>
+      <w:r>
+        <w:rPr>
+          <w:sz w:val="32"/>
+          <w:szCs w:val="32"/>
+        </w:rPr>
+        <w:t>createUser</w:t>
+      </w:r>
+      <w:proofErr w:type="spellEnd"/>
+      <w:r>
+        <w:rPr>
+          <w:sz w:val="32"/>
+          <w:szCs w:val="32"/>
+        </w:rPr>
+        <w:t>(</w:t>
+      </w:r>
+      <w:proofErr w:type="gramEnd"/>
+    </w:p>
+    <w:p>
+      <w:pPr>
+        <w:rPr>
+          <w:sz w:val="32"/>
+          <w:szCs w:val="32"/>
+        </w:rPr>
+      </w:pPr>
+      <w:r>
+        <w:rPr>
+          <w:sz w:val="32"/>
+          <w:szCs w:val="32"/>
+        </w:rPr>
+        <w:t xml:space="preserve">        @PathVariable Long </w:t>
+      </w:r>
+      <w:proofErr w:type="spellStart"/>
+      <w:r>
+        <w:rPr>
+          <w:sz w:val="32"/>
+          <w:szCs w:val="32"/>
+        </w:rPr>
+        <w:t>userId</w:t>
+      </w:r>
+      <w:proofErr w:type="spellEnd"/>
+      <w:r>
+        <w:rPr>
+          <w:sz w:val="32"/>
+          <w:szCs w:val="32"/>
+        </w:rPr>
+        <w:t>,</w:t>
+      </w:r>
+    </w:p>
+    <w:p>
+      <w:pPr>
+        <w:rPr>
+          <w:sz w:val="32"/>
+          <w:szCs w:val="32"/>
+        </w:rPr>
+      </w:pPr>
+      <w:r>
+        <w:rPr>
+          <w:sz w:val="32"/>
+          <w:szCs w:val="32"/>
+        </w:rPr>
+        <w:lastRenderedPageBreak/>
+        <w:t xml:space="preserve">        @RequestBody </w:t>
+      </w:r>
+      <w:proofErr w:type="spellStart"/>
+      <w:r>
+        <w:rPr>
+          <w:sz w:val="32"/>
+          <w:szCs w:val="32"/>
+        </w:rPr>
+        <w:t>UserRequest</w:t>
+      </w:r>
+      <w:proofErr w:type="spellEnd"/>
+      <w:r>
+        <w:rPr>
+          <w:sz w:val="32"/>
+          <w:szCs w:val="32"/>
+        </w:rPr>
+        <w:t xml:space="preserve"> request) {</w:t>
+      </w:r>
+    </w:p>
+    <w:p>
+      <w:pPr>
+        <w:rPr>
+          <w:sz w:val="32"/>
+          <w:szCs w:val="32"/>
+        </w:rPr>
+      </w:pPr>
+    </w:p>
+    <w:p>
+      <w:pPr>
+        <w:rPr>
+          <w:sz w:val="32"/>
+          <w:szCs w:val="32"/>
+        </w:rPr>
+      </w:pPr>
+      <w:r>
+        <w:rPr>
+          <w:sz w:val="32"/>
+          <w:szCs w:val="32"/>
+        </w:rPr>
+        <w:t>}</w:t>
+      </w:r>
+    </w:p>
+    <w:p>
+      <w:pPr>
+        <w:rPr>
+          <w:sz w:val="32"/>
+          <w:szCs w:val="32"/>
+        </w:rPr>
+      </w:pPr>
+      <w:proofErr w:type="gramStart"/>
+      <w:r>
+        <w:rPr>
+          <w:sz w:val="32"/>
+          <w:szCs w:val="32"/>
+        </w:rPr>
+        <w:t>So</w:t>
+      </w:r>
+      <w:proofErr w:type="gramEnd"/>
+      <w:r>
+        <w:rPr>
+          <w:sz w:val="32"/>
+          <w:szCs w:val="32"/>
+        </w:rPr>
+        <w:t xml:space="preserve"> </w:t>
+      </w:r>
+      <w:r>
+        <w:rPr>
+          <w:b/>
+          <w:bCs/>
+          <w:sz w:val="32"/>
+          <w:szCs w:val="32"/>
+        </w:rPr>
+        <w:t>the API designer decides where data should go</w:t>
+      </w:r>
+      <w:r>
+        <w:rPr>
+          <w:sz w:val="32"/>
+          <w:szCs w:val="32"/>
+        </w:rPr>
+        <w:t>.</w:t>
+      </w:r>
+    </w:p>
+    <w:p>
+      <w:pPr>
+        <w:rPr>
+          <w:sz w:val="32"/>
+          <w:szCs w:val="32"/>
+        </w:rPr>
+      </w:pPr>
+      <w:r>
+        <w:rPr>
+          <w:sz w:val="32"/>
+          <w:szCs w:val="32"/>
+        </w:rPr>
+        <w:pict w14:anchorId="7CB99FFF">
+          <v:rect id="_x0000_i1097" style="width:0;height:1.5pt" o:hralign="center" o:hrstd="t" o:hr="t" fillcolor="#a0a0a0" stroked="f"/>
+        </w:pict>
+      </w:r>
+    </w:p>
+    <w:p>
+      <w:pPr>
+        <w:rPr>
+          <w:b/>
+          <w:bCs/>
+          <w:sz w:val="32"/>
+          <w:szCs w:val="32"/>
+        </w:rPr>
+      </w:pPr>
+      <w:r>
+        <w:rPr>
+          <w:b/>
+          <w:bCs/>
+          <w:sz w:val="32"/>
+          <w:szCs w:val="32"/>
+        </w:rPr>
+        <w:t>5️</w:t>
+      </w:r>
+      <w:r>
+        <w:rPr>
+          <w:rFonts w:ascii="Segoe UI Symbol" w:hAnsi="Segoe UI Symbol" w:cs="Segoe UI Symbol"/>
+          <w:b/>
+          <w:bCs/>
+          <w:sz w:val="32"/>
+          <w:szCs w:val="32"/>
+        </w:rPr>
+        <w:t>⃣</w:t>
+      </w:r>
+      <w:r>
+        <w:rPr>
+          <w:b/>
+          <w:bCs/>
+          <w:sz w:val="32"/>
+          <w:szCs w:val="32"/>
+        </w:rPr>
+        <w:t xml:space="preserve"> Why different places exist to send data</w:t>
+      </w:r>
+    </w:p>
+    <w:p>
+      <w:pPr>
+        <w:rPr>
+          <w:sz w:val="32"/>
+          <w:szCs w:val="32"/>
+        </w:rPr>
+      </w:pPr>
+      <w:r>
+        <w:rPr>
+          <w:sz w:val="32"/>
+          <w:szCs w:val="32"/>
+        </w:rPr>
+        <w:t>Each location has a typical purpose.</w:t>
+      </w:r>
+    </w:p>
+    <w:tbl>
+      <w:tblPr>
+        <w:tblW w:w="0" w:type="auto"/>
+        <w:tblCellSpacing w:w="15" w:type="dxa"/>
+        <w:tblCellMar>
+          <w:top w:w="15" w:type="dxa"/>
+          <w:left w:w="15" w:type="dxa"/>
+          <w:bottom w:w="15" w:type="dxa"/>
+          <w:right w:w="15" w:type="dxa"/>
+        </w:tblCellMar>
+        <w:tblLook w:val="04A0" w:firstRow="1" w:lastRow="0" w:firstColumn="1" w:lastColumn="0" w:noHBand="0" w:noVBand="1"/>
+      </w:tblPr>
+      <w:tblGrid>
+        <w:gridCol w:w="2488"/>
+        <w:gridCol w:w="1913"/>
+      </w:tblGrid>
+      <w:tr>
+        <w:trPr>
+          <w:tblHeader/>
+          <w:tblCellSpacing w:w="15" w:type="dxa"/>
+        </w:trPr>
+        <w:tc>
+          <w:tcPr>
+            <w:tcW w:w="0" w:type="auto"/>
+            <w:vAlign w:val="center"/>
+            <w:hideMark/>
+          </w:tcPr>
+          <w:p>
+            <w:pPr>
+              <w:rPr>
+                <w:b/>
+                <w:bCs/>
+                <w:sz w:val="32"/>
+                <w:szCs w:val="32"/>
+              </w:rPr>
+            </w:pPr>
+            <w:r>
+              <w:rPr>
+                <w:b/>
+                <w:bCs/>
+                <w:sz w:val="32"/>
+                <w:szCs w:val="32"/>
+              </w:rPr>
+              <w:t>Data type</w:t>
+            </w:r>
+          </w:p>
+        </w:tc>
+        <w:tc>
+          <w:tcPr>
+            <w:tcW w:w="0" w:type="auto"/>
+            <w:vAlign w:val="center"/>
+            <w:hideMark/>
+          </w:tcPr>
+          <w:p>
+            <w:pPr>
+              <w:rPr>
+                <w:b/>
+                <w:bCs/>
+                <w:sz w:val="32"/>
+                <w:szCs w:val="32"/>
+              </w:rPr>
+            </w:pPr>
+            <w:r>
+              <w:rPr>
+                <w:b/>
+                <w:bCs/>
+                <w:sz w:val="32"/>
+                <w:szCs w:val="32"/>
+              </w:rPr>
+              <w:t>Where it goes</w:t>
+            </w:r>
+          </w:p>
+        </w:tc>
+      </w:tr>
+      <w:tr>
+        <w:trPr>
+          <w:tblCellSpacing w:w="15" w:type="dxa"/>
+        </w:trPr>
+        <w:tc>
+          <w:tcPr>
+            <w:tcW w:w="0" w:type="auto"/>
+            <w:vAlign w:val="center"/>
+            <w:hideMark/>
+          </w:tcPr>
+          <w:p>
+            <w:pPr>
+              <w:rPr>
+                <w:sz w:val="32"/>
+                <w:szCs w:val="32"/>
+              </w:rPr>
+            </w:pPr>
+            <w:r>
+              <w:rPr>
+                <w:sz w:val="32"/>
+                <w:szCs w:val="32"/>
+              </w:rPr>
+              <w:t>Resource identity</w:t>
+            </w:r>
+          </w:p>
+        </w:tc>
+        <w:tc>
+          <w:tcPr>
+            <w:tcW w:w="0" w:type="auto"/>
+            <w:vAlign w:val="center"/>
+            <w:hideMark/>
+          </w:tcPr>
+          <w:p>
+            <w:pPr>
+              <w:rPr>
+                <w:sz w:val="32"/>
+                <w:szCs w:val="32"/>
+              </w:rPr>
+            </w:pPr>
+            <w:r>
+              <w:rPr>
+                <w:sz w:val="32"/>
+                <w:szCs w:val="32"/>
+              </w:rPr>
+              <w:t>Path variable</w:t>
+            </w:r>
+          </w:p>
+        </w:tc>
+      </w:tr>
+      <w:tr>
+        <w:trPr>
+          <w:tblCellSpacing w:w="15" w:type="dxa"/>
+        </w:trPr>
+        <w:tc>
+          <w:tcPr>
+            <w:tcW w:w="0" w:type="auto"/>
+            <w:vAlign w:val="center"/>
+            <w:hideMark/>
+          </w:tcPr>
+          <w:p>
+            <w:pPr>
+              <w:rPr>
+                <w:sz w:val="32"/>
+                <w:szCs w:val="32"/>
+              </w:rPr>
+            </w:pPr>
+            <w:r>
+              <w:rPr>
+                <w:sz w:val="32"/>
+                <w:szCs w:val="32"/>
+              </w:rPr>
+              <w:t>Filtering/search</w:t>
+            </w:r>
+          </w:p>
+        </w:tc>
+        <w:tc>
+          <w:tcPr>
+            <w:tcW w:w="0" w:type="auto"/>
+            <w:vAlign w:val="center"/>
+            <w:hideMark/>
+          </w:tcPr>
+          <w:p>
+            <w:pPr>
+              <w:rPr>
+                <w:sz w:val="32"/>
+                <w:szCs w:val="32"/>
+              </w:rPr>
+            </w:pPr>
+            <w:r>
+              <w:rPr>
+                <w:sz w:val="32"/>
+                <w:szCs w:val="32"/>
+              </w:rPr>
+              <w:t>Query params</w:t>
+            </w:r>
+          </w:p>
+        </w:tc>
+      </w:tr>
+      <w:tr>
+        <w:trPr>
+          <w:tblCellSpacing w:w="15" w:type="dxa"/>
+        </w:trPr>
+        <w:tc>
+          <w:tcPr>
+            <w:tcW w:w="0" w:type="auto"/>
+            <w:vAlign w:val="center"/>
+            <w:hideMark/>
+          </w:tcPr>
+          <w:p>
+            <w:pPr>
+              <w:rPr>
+                <w:sz w:val="32"/>
+                <w:szCs w:val="32"/>
+              </w:rPr>
+            </w:pPr>
+            <w:r>
+              <w:rPr>
+                <w:sz w:val="32"/>
+                <w:szCs w:val="32"/>
+              </w:rPr>
+              <w:t>Metadata/auth</w:t>
+            </w:r>
+          </w:p>
+        </w:tc>
+        <w:tc>
+          <w:tcPr>
+            <w:tcW w:w="0" w:type="auto"/>
+            <w:vAlign w:val="center"/>
+            <w:hideMark/>
+          </w:tcPr>
+          <w:p>
+            <w:pPr>
+              <w:rPr>
+                <w:sz w:val="32"/>
+                <w:szCs w:val="32"/>
+              </w:rPr>
+            </w:pPr>
+            <w:r>
+              <w:rPr>
+                <w:sz w:val="32"/>
+                <w:szCs w:val="32"/>
+              </w:rPr>
+              <w:t>Headers</w:t>
+            </w:r>
+          </w:p>
+        </w:tc>
+      </w:tr>
+      <w:tr>
+        <w:trPr>
+          <w:tblCellSpacing w:w="15" w:type="dxa"/>
+        </w:trPr>
+        <w:tc>
+          <w:tcPr>
+            <w:tcW w:w="0" w:type="auto"/>
+            <w:vAlign w:val="center"/>
+            <w:hideMark/>
+          </w:tcPr>
+          <w:p>
+            <w:pPr>
+              <w:rPr>
+                <w:sz w:val="32"/>
+                <w:szCs w:val="32"/>
+              </w:rPr>
+            </w:pPr>
+            <w:r>
+              <w:rPr>
+                <w:sz w:val="32"/>
+                <w:szCs w:val="32"/>
+              </w:rPr>
+              <w:t>Main data payload</w:t>
+            </w:r>
+          </w:p>
+        </w:tc>
+        <w:tc>
+          <w:tcPr>
+            <w:tcW w:w="0" w:type="auto"/>
+            <w:vAlign w:val="center"/>
+            <w:hideMark/>
+          </w:tcPr>
+          <w:p>
+            <w:pPr>
+              <w:rPr>
+                <w:sz w:val="32"/>
+                <w:szCs w:val="32"/>
+              </w:rPr>
+            </w:pPr>
+            <w:r>
+              <w:rPr>
+                <w:sz w:val="32"/>
+                <w:szCs w:val="32"/>
+              </w:rPr>
+              <w:t>Request body</w:t>
+            </w:r>
+          </w:p>
+        </w:tc>
+      </w:tr>
+    </w:tbl>
+    <w:p>
+      <w:pPr>
+        <w:rPr>
+          <w:sz w:val="32"/>
+          <w:szCs w:val="32"/>
+        </w:rPr>
+      </w:pPr>
+      <w:r>
+        <w:rPr>
+          <w:sz w:val="32"/>
+          <w:szCs w:val="32"/>
+        </w:rPr>
+        <w:t>Example:</w:t>
+      </w:r>
+    </w:p>
+    <w:p>
+      <w:pPr>
+        <w:rPr>
+          <w:sz w:val="32"/>
+          <w:szCs w:val="32"/>
+        </w:rPr>
+      </w:pPr>
+      <w:r>
+        <w:rPr>
+          <w:sz w:val="32"/>
+          <w:szCs w:val="32"/>
+        </w:rPr>
+        <w:t>POST /orders/101?currency=</w:t>
+      </w:r>
+      <w:proofErr w:type="spellStart"/>
+      <w:r>
+        <w:rPr>
+          <w:sz w:val="32"/>
+          <w:szCs w:val="32"/>
+        </w:rPr>
+        <w:t>usd</w:t>
+      </w:r>
+      <w:proofErr w:type="spellEnd"/>
+    </w:p>
+    <w:p>
+      <w:pPr>
+        <w:rPr>
+          <w:sz w:val="32"/>
+          <w:szCs w:val="32"/>
+        </w:rPr>
+      </w:pPr>
+      <w:r>
+        <w:rPr>
+          <w:sz w:val="32"/>
+          <w:szCs w:val="32"/>
+        </w:rPr>
+        <w:t>Header: Authorization=token</w:t>
+      </w:r>
+    </w:p>
+    <w:p>
+      <w:pPr>
+        <w:rPr>
+          <w:sz w:val="32"/>
+          <w:szCs w:val="32"/>
+        </w:rPr>
+      </w:pPr>
+      <w:r>
+        <w:rPr>
+          <w:sz w:val="32"/>
+          <w:szCs w:val="32"/>
+        </w:rPr>
+        <w:t>Body:</w:t>
+      </w:r>
+    </w:p>
+    <w:p>
+      <w:pPr>
+        <w:rPr>
+          <w:sz w:val="32"/>
+          <w:szCs w:val="32"/>
+        </w:rPr>
+      </w:pPr>
+      <w:r>
+        <w:rPr>
+          <w:sz w:val="32"/>
+          <w:szCs w:val="32"/>
+        </w:rPr>
+        <w:t>{</w:t>
+      </w:r>
+    </w:p>
+    <w:p>
+      <w:pPr>
+        <w:rPr>
+          <w:sz w:val="32"/>
+          <w:szCs w:val="32"/>
+        </w:rPr>
+      </w:pPr>
+      <w:r>
+        <w:rPr>
+          <w:sz w:val="32"/>
+          <w:szCs w:val="32"/>
+        </w:rPr>
+        <w:t xml:space="preserve"> "productId":55,</w:t>
+      </w:r>
+    </w:p>
+    <w:p>
+      <w:pPr>
+        <w:rPr>
+          <w:sz w:val="32"/>
+          <w:szCs w:val="32"/>
+        </w:rPr>
+      </w:pPr>
+      <w:r>
+        <w:rPr>
+          <w:sz w:val="32"/>
+          <w:szCs w:val="32"/>
+        </w:rPr>
+        <w:t xml:space="preserve"> "quantity":2</w:t>
+      </w:r>
+    </w:p>
+    <w:p>
+      <w:pPr>
+        <w:rPr>
+          <w:sz w:val="32"/>
+          <w:szCs w:val="32"/>
+        </w:rPr>
+      </w:pPr>
+      <w:r>
+        <w:rPr>
+          <w:sz w:val="32"/>
+          <w:szCs w:val="32"/>
+        </w:rPr>
+        <w:t>}</w:t>
+      </w:r>
+    </w:p>
+    <w:p>
+      <w:pPr>
+        <w:rPr>
+          <w:sz w:val="32"/>
+          <w:szCs w:val="32"/>
+        </w:rPr>
+      </w:pPr>
+      <w:r>
+        <w:rPr>
+          <w:sz w:val="32"/>
+          <w:szCs w:val="32"/>
+        </w:rPr>
+        <w:pict w14:anchorId="783C023A">
+          <v:rect id="_x0000_i1098" style="width:0;height:1.5pt" o:hralign="center" o:hrstd="t" o:hr="t" fillcolor="#a0a0a0" stroked="f"/>
+        </w:pict>
+      </w:r>
+    </w:p>
+    <w:p>
+      <w:pPr>
+        <w:rPr>
+          <w:b/>
+          <w:bCs/>
+          <w:sz w:val="32"/>
+          <w:szCs w:val="32"/>
+        </w:rPr>
+      </w:pPr>
+      <w:r>
+        <w:rPr>
+          <w:b/>
+          <w:bCs/>
+          <w:sz w:val="32"/>
+          <w:szCs w:val="32"/>
+        </w:rPr>
+        <w:t>6️</w:t>
+      </w:r>
+      <w:r>
+        <w:rPr>
+          <w:rFonts w:ascii="Segoe UI Symbol" w:hAnsi="Segoe UI Symbol" w:cs="Segoe UI Symbol"/>
+          <w:b/>
+          <w:bCs/>
+          <w:sz w:val="32"/>
+          <w:szCs w:val="32"/>
+        </w:rPr>
+        <w:t>⃣</w:t>
+      </w:r>
+      <w:r>
+        <w:rPr>
+          <w:b/>
+          <w:bCs/>
+          <w:sz w:val="32"/>
+          <w:szCs w:val="32"/>
+        </w:rPr>
+        <w:t xml:space="preserve"> What is the real essential flow</w:t>
+      </w:r>
+    </w:p>
+    <w:p>
+      <w:pPr>
+        <w:rPr>
+          <w:sz w:val="32"/>
+          <w:szCs w:val="32"/>
+        </w:rPr>
+      </w:pPr>
+      <w:r>
+        <w:rPr>
+          <w:sz w:val="32"/>
+          <w:szCs w:val="32"/>
+        </w:rPr>
+        <w:t>Every API follows this simple pattern.</w:t>
+      </w:r>
+    </w:p>
+    <w:p>
+      <w:pPr>
+        <w:rPr>
+          <w:sz w:val="32"/>
+          <w:szCs w:val="32"/>
+        </w:rPr>
+      </w:pPr>
+      <w:r>
+        <w:rPr>
+          <w:sz w:val="32"/>
+          <w:szCs w:val="32"/>
+        </w:rPr>
+        <w:lastRenderedPageBreak/>
+        <w:t>Client</w:t>
+      </w:r>
+    </w:p>
+    <w:p>
+      <w:pPr>
+        <w:rPr>
+          <w:sz w:val="32"/>
+          <w:szCs w:val="32"/>
+        </w:rPr>
+      </w:pPr>
+      <w:r>
+        <w:rPr>
+          <w:sz w:val="32"/>
+          <w:szCs w:val="32"/>
+        </w:rPr>
+        <w:t xml:space="preserve">   |</w:t>
+      </w:r>
+    </w:p>
+    <w:p>
+      <w:pPr>
+        <w:rPr>
+          <w:sz w:val="32"/>
+          <w:szCs w:val="32"/>
+        </w:rPr>
+      </w:pPr>
+      <w:r>
+        <w:rPr>
+          <w:sz w:val="32"/>
+          <w:szCs w:val="32"/>
+        </w:rPr>
+        <w:t xml:space="preserve">   | HTTP Request</w:t>
+      </w:r>
+    </w:p>
+    <w:p>
+      <w:pPr>
+        <w:rPr>
+          <w:sz w:val="32"/>
+          <w:szCs w:val="32"/>
+        </w:rPr>
+      </w:pPr>
+      <w:r>
+        <w:rPr>
+          <w:sz w:val="32"/>
+          <w:szCs w:val="32"/>
+        </w:rPr>
+        <w:t xml:space="preserve">   v</w:t>
+      </w:r>
+    </w:p>
+    <w:p>
+      <w:pPr>
+        <w:rPr>
+          <w:sz w:val="32"/>
+          <w:szCs w:val="32"/>
+        </w:rPr>
+      </w:pPr>
+      <w:r>
+        <w:rPr>
+          <w:sz w:val="32"/>
+          <w:szCs w:val="32"/>
+        </w:rPr>
+        <w:t>Spring matches URL + HTTP method</w:t>
+      </w:r>
+    </w:p>
+    <w:p>
+      <w:pPr>
+        <w:rPr>
+          <w:sz w:val="32"/>
+          <w:szCs w:val="32"/>
+        </w:rPr>
+      </w:pPr>
+      <w:r>
+        <w:rPr>
+          <w:sz w:val="32"/>
+          <w:szCs w:val="32"/>
+        </w:rPr>
+        <w:t xml:space="preserve">   |</w:t>
+      </w:r>
+    </w:p>
+    <w:p>
+      <w:pPr>
+        <w:rPr>
+          <w:sz w:val="32"/>
+          <w:szCs w:val="32"/>
+        </w:rPr>
+      </w:pPr>
+      <w:r>
+        <w:rPr>
+          <w:sz w:val="32"/>
+          <w:szCs w:val="32"/>
+        </w:rPr>
+        <w:t xml:space="preserve">   v</w:t>
+      </w:r>
+    </w:p>
+    <w:p>
+      <w:pPr>
+        <w:rPr>
+          <w:sz w:val="32"/>
+          <w:szCs w:val="32"/>
+        </w:rPr>
+      </w:pPr>
+      <w:r>
+        <w:rPr>
+          <w:sz w:val="32"/>
+          <w:szCs w:val="32"/>
+        </w:rPr>
+        <w:t>Controller method runs</w:t>
+      </w:r>
+    </w:p>
+    <w:p>
+      <w:pPr>
+        <w:rPr>
+          <w:sz w:val="32"/>
+          <w:szCs w:val="32"/>
+        </w:rPr>
+      </w:pPr>
+      <w:r>
+        <w:rPr>
+          <w:sz w:val="32"/>
+          <w:szCs w:val="32"/>
+        </w:rPr>
+        <w:t xml:space="preserve">   |</w:t>
+      </w:r>
+    </w:p>
+    <w:p>
+      <w:pPr>
+        <w:rPr>
+          <w:sz w:val="32"/>
+          <w:szCs w:val="32"/>
+        </w:rPr>
+      </w:pPr>
+      <w:r>
+        <w:rPr>
+          <w:sz w:val="32"/>
+          <w:szCs w:val="32"/>
+        </w:rPr>
+        <w:t xml:space="preserve">   | Parameters extract data</w:t>
+      </w:r>
+    </w:p>
+    <w:p>
+      <w:pPr>
+        <w:rPr>
+          <w:sz w:val="32"/>
+          <w:szCs w:val="32"/>
+        </w:rPr>
+      </w:pPr>
+      <w:r>
+        <w:rPr>
+          <w:sz w:val="32"/>
+          <w:szCs w:val="32"/>
+        </w:rPr>
+        <w:t xml:space="preserve">   v</w:t>
+      </w:r>
+    </w:p>
+    <w:p>
+      <w:pPr>
+        <w:rPr>
+          <w:sz w:val="32"/>
+          <w:szCs w:val="32"/>
+        </w:rPr>
+      </w:pPr>
+      <w:r>
+        <w:rPr>
+          <w:sz w:val="32"/>
+          <w:szCs w:val="32"/>
+        </w:rPr>
+        <w:t>Business logic executes</w:t>
+      </w:r>
+    </w:p>
+    <w:p>
+      <w:pPr>
+        <w:rPr>
+          <w:sz w:val="32"/>
+          <w:szCs w:val="32"/>
+        </w:rPr>
+      </w:pPr>
+      <w:r>
+        <w:rPr>
+          <w:sz w:val="32"/>
+          <w:szCs w:val="32"/>
+        </w:rPr>
+        <w:t xml:space="preserve">   |</w:t>
+      </w:r>
+    </w:p>
+    <w:p>
+      <w:pPr>
+        <w:rPr>
+          <w:sz w:val="32"/>
+          <w:szCs w:val="32"/>
+        </w:rPr>
+      </w:pPr>
+      <w:r>
+        <w:rPr>
+          <w:sz w:val="32"/>
+          <w:szCs w:val="32"/>
+        </w:rPr>
+        <w:t xml:space="preserve">   v</w:t>
+      </w:r>
+    </w:p>
+    <w:p>
+      <w:pPr>
+        <w:rPr>
+          <w:sz w:val="32"/>
+          <w:szCs w:val="32"/>
+        </w:rPr>
+      </w:pPr>
+      <w:r>
+        <w:rPr>
+          <w:sz w:val="32"/>
+          <w:szCs w:val="32"/>
+        </w:rPr>
+        <w:t>Response returned</w:t>
+      </w:r>
+    </w:p>
+    <w:p>
+      <w:pPr>
+        <w:rPr>
+          <w:sz w:val="32"/>
+          <w:szCs w:val="32"/>
+        </w:rPr>
+      </w:pPr>
+      <w:r>
+        <w:rPr>
+          <w:sz w:val="32"/>
+          <w:szCs w:val="32"/>
+        </w:rPr>
+        <w:pict w14:anchorId="312E705E">
+          <v:rect id="_x0000_i1099" style="width:0;height:1.5pt" o:hralign="center" o:hrstd="t" o:hr="t" fillcolor="#a0a0a0" stroked="f"/>
+        </w:pict>
+      </w:r>
+    </w:p>
+    <w:p>
+      <w:pPr>
+        <w:rPr>
+          <w:b/>
+          <w:bCs/>
+          <w:sz w:val="32"/>
+          <w:szCs w:val="32"/>
+        </w:rPr>
+      </w:pPr>
+      <w:r>
+        <w:rPr>
+          <w:b/>
+          <w:bCs/>
+          <w:sz w:val="32"/>
+          <w:szCs w:val="32"/>
+        </w:rPr>
+        <w:t>7️</w:t>
+      </w:r>
+      <w:r>
+        <w:rPr>
+          <w:rFonts w:ascii="Segoe UI Symbol" w:hAnsi="Segoe UI Symbol" w:cs="Segoe UI Symbol"/>
+          <w:b/>
+          <w:bCs/>
+          <w:sz w:val="32"/>
+          <w:szCs w:val="32"/>
+        </w:rPr>
+        <w:t>⃣</w:t>
+      </w:r>
+      <w:r>
+        <w:rPr>
+          <w:b/>
+          <w:bCs/>
+          <w:sz w:val="32"/>
+          <w:szCs w:val="32"/>
+        </w:rPr>
+        <w:t xml:space="preserve"> The key realization you just reached</w:t>
+      </w:r>
+    </w:p>
+    <w:p>
+      <w:pPr>
+        <w:rPr>
+          <w:sz w:val="32"/>
+          <w:szCs w:val="32"/>
+        </w:rPr>
+      </w:pPr>
+      <w:r>
+        <w:rPr>
+          <w:sz w:val="32"/>
+          <w:szCs w:val="32"/>
+        </w:rPr>
+        <w:t>You correctly understood:</w:t>
+      </w:r>
+    </w:p>
+    <w:p>
+      <w:pPr>
+        <w:rPr>
+          <w:sz w:val="32"/>
+          <w:szCs w:val="32"/>
+        </w:rPr>
+      </w:pPr>
+      <w:r>
+        <w:rPr>
+          <w:sz w:val="32"/>
+          <w:szCs w:val="32"/>
+        </w:rPr>
+        <w:t xml:space="preserve">Parameters like @RequestParam, @PathVariable, @RequestBody are </w:t>
+      </w:r>
+      <w:r>
+        <w:rPr>
+          <w:b/>
+          <w:bCs/>
+          <w:sz w:val="32"/>
+          <w:szCs w:val="32"/>
+        </w:rPr>
+        <w:t>not for sending data</w:t>
+      </w:r>
+      <w:r>
+        <w:rPr>
+          <w:sz w:val="32"/>
+          <w:szCs w:val="32"/>
+        </w:rPr>
+        <w:t>.</w:t>
+      </w:r>
+    </w:p>
+    <w:p>
+      <w:pPr>
+        <w:rPr>
+          <w:sz w:val="32"/>
+          <w:szCs w:val="32"/>
+        </w:rPr>
+      </w:pPr>
+      <w:r>
+        <w:rPr>
+          <w:sz w:val="32"/>
+          <w:szCs w:val="32"/>
+        </w:rPr>
+        <w:t xml:space="preserve">They are </w:t>
+      </w:r>
+      <w:r>
+        <w:rPr>
+          <w:b/>
+          <w:bCs/>
+          <w:sz w:val="32"/>
+          <w:szCs w:val="32"/>
+        </w:rPr>
+        <w:t>for extracting data that already exists in the request</w:t>
+      </w:r>
+      <w:r>
+        <w:rPr>
+          <w:sz w:val="32"/>
+          <w:szCs w:val="32"/>
+        </w:rPr>
+        <w:t>.</w:t>
+      </w:r>
+    </w:p>
+    <w:p>
+      <w:pPr>
+        <w:rPr>
+          <w:sz w:val="32"/>
+          <w:szCs w:val="32"/>
+        </w:rPr>
+      </w:pPr>
+      <w:r>
+        <w:rPr>
+          <w:sz w:val="32"/>
+          <w:szCs w:val="32"/>
+        </w:rPr>
+        <w:t xml:space="preserve">The </w:t>
+      </w:r>
+      <w:r>
+        <w:rPr>
+          <w:b/>
+          <w:bCs/>
+          <w:sz w:val="32"/>
+          <w:szCs w:val="32"/>
+        </w:rPr>
+        <w:t>client decides what to send</w:t>
+      </w:r>
+      <w:r>
+        <w:rPr>
+          <w:sz w:val="32"/>
+          <w:szCs w:val="32"/>
+        </w:rPr>
+        <w:t xml:space="preserve">, and the </w:t>
+      </w:r>
+      <w:r>
+        <w:rPr>
+          <w:b/>
+          <w:bCs/>
+          <w:sz w:val="32"/>
+          <w:szCs w:val="32"/>
+        </w:rPr>
+        <w:t>API design defines where it should go</w:t>
+      </w:r>
+      <w:r>
+        <w:rPr>
+          <w:sz w:val="32"/>
+          <w:szCs w:val="32"/>
+        </w:rPr>
+        <w:t>.</w:t>
+      </w:r>
+    </w:p>
+    <w:p>
+      <w:pPr>
+        <w:rPr>
+          <w:sz w:val="32"/>
+          <w:szCs w:val="32"/>
+        </w:rPr>
+      </w:pPr>
+      <w:r>
+        <w:rPr>
+          <w:sz w:val="32"/>
+          <w:szCs w:val="32"/>
+        </w:rPr>
+        <w:pict w14:anchorId="5D99A561">
+          <v:rect id="_x0000_i1100" style="width:0;height:1.5pt" o:hralign="center" o:hrstd="t" o:hr="t" fillcolor="#a0a0a0" stroked="f"/>
+        </w:pict>
+      </w:r>
+    </w:p>
+    <w:p>
+      <w:pPr>
+        <w:rPr>
+          <w:b/>
+          <w:bCs/>
+          <w:sz w:val="32"/>
+          <w:szCs w:val="32"/>
+        </w:rPr>
+      </w:pPr>
+      <w:r>
+        <w:rPr>
+          <w:b/>
+          <w:bCs/>
+          <w:sz w:val="32"/>
+          <w:szCs w:val="32"/>
+        </w:rPr>
+        <w:lastRenderedPageBreak/>
+        <w:t>8️</w:t>
+      </w:r>
+      <w:r>
+        <w:rPr>
+          <w:rFonts w:ascii="Segoe UI Symbol" w:hAnsi="Segoe UI Symbol" w:cs="Segoe UI Symbol"/>
+          <w:b/>
+          <w:bCs/>
+          <w:sz w:val="32"/>
+          <w:szCs w:val="32"/>
+        </w:rPr>
+        <w:t>⃣</w:t>
+      </w:r>
+      <w:r>
+        <w:rPr>
+          <w:b/>
+          <w:bCs/>
+          <w:sz w:val="32"/>
+          <w:szCs w:val="32"/>
+        </w:rPr>
+        <w:t xml:space="preserve"> What you should remember as a beginner</w:t>
+      </w:r>
+    </w:p>
+    <w:p>
+      <w:pPr>
+        <w:rPr>
+          <w:sz w:val="32"/>
+          <w:szCs w:val="32"/>
+        </w:rPr>
+      </w:pPr>
+      <w:r>
+        <w:rPr>
+          <w:sz w:val="32"/>
+          <w:szCs w:val="32"/>
+        </w:rPr>
+        <w:t xml:space="preserve">When writing APIs in </w:t>
+      </w:r>
+      <w:r>
+        <w:rPr>
+          <w:b/>
+          <w:bCs/>
+          <w:sz w:val="32"/>
+          <w:szCs w:val="32"/>
+        </w:rPr>
+        <w:t>Spring Boot</w:t>
+      </w:r>
+      <w:r>
+        <w:rPr>
+          <w:sz w:val="32"/>
+          <w:szCs w:val="32"/>
+        </w:rPr>
+        <w:t>:</w:t>
+      </w:r>
+    </w:p>
+    <w:p>
+      <w:pPr>
+        <w:rPr>
+          <w:sz w:val="32"/>
+          <w:szCs w:val="32"/>
+        </w:rPr>
+      </w:pPr>
+      <w:r>
+        <w:rPr>
+          <w:sz w:val="32"/>
+          <w:szCs w:val="32"/>
+        </w:rPr>
+        <w:t>1️</w:t>
+      </w:r>
+      <w:r>
+        <w:rPr>
+          <w:rFonts w:ascii="Segoe UI Symbol" w:hAnsi="Segoe UI Symbol" w:cs="Segoe UI Symbol"/>
+          <w:sz w:val="32"/>
+          <w:szCs w:val="32"/>
+        </w:rPr>
+        <w:t>⃣</w:t>
+      </w:r>
+      <w:r>
+        <w:rPr>
+          <w:sz w:val="32"/>
+          <w:szCs w:val="32"/>
+        </w:rPr>
+        <w:t xml:space="preserve"> URL + HTTP method decide </w:t>
+      </w:r>
+      <w:r>
+        <w:rPr>
+          <w:b/>
+          <w:bCs/>
+          <w:sz w:val="32"/>
+          <w:szCs w:val="32"/>
+        </w:rPr>
+        <w:t>which controller method runs</w:t>
+      </w:r>
+    </w:p>
+    <w:p>
+      <w:pPr>
+        <w:rPr>
+          <w:sz w:val="32"/>
+          <w:szCs w:val="32"/>
+        </w:rPr>
+      </w:pPr>
+      <w:r>
+        <w:rPr>
+          <w:sz w:val="32"/>
+          <w:szCs w:val="32"/>
+        </w:rPr>
+        <w:t>2️</w:t>
+      </w:r>
+      <w:r>
+        <w:rPr>
+          <w:rFonts w:ascii="Segoe UI Symbol" w:hAnsi="Segoe UI Symbol" w:cs="Segoe UI Symbol"/>
+          <w:sz w:val="32"/>
+          <w:szCs w:val="32"/>
+        </w:rPr>
+        <w:t>⃣</w:t>
+      </w:r>
+      <w:r>
+        <w:rPr>
+          <w:sz w:val="32"/>
+          <w:szCs w:val="32"/>
+        </w:rPr>
+        <w:t xml:space="preserve"> Parameters decide </w:t>
+      </w:r>
+      <w:r>
+        <w:rPr>
+          <w:b/>
+          <w:bCs/>
+          <w:sz w:val="32"/>
+          <w:szCs w:val="32"/>
+        </w:rPr>
+        <w:t>how to read incoming data</w:t>
+      </w:r>
+    </w:p>
+    <w:p>
+      <w:pPr>
+        <w:rPr>
+          <w:sz w:val="32"/>
+          <w:szCs w:val="32"/>
+        </w:rPr>
+      </w:pPr>
+      <w:r>
+        <w:rPr>
+          <w:sz w:val="32"/>
+          <w:szCs w:val="32"/>
+        </w:rPr>
+        <w:t>3️</w:t>
+      </w:r>
+      <w:r>
+        <w:rPr>
+          <w:rFonts w:ascii="Segoe UI Symbol" w:hAnsi="Segoe UI Symbol" w:cs="Segoe UI Symbol"/>
+          <w:sz w:val="32"/>
+          <w:szCs w:val="32"/>
+        </w:rPr>
+        <w:t>⃣</w:t>
+      </w:r>
+      <w:r>
+        <w:rPr>
+          <w:sz w:val="32"/>
+          <w:szCs w:val="32"/>
+        </w:rPr>
+        <w:t xml:space="preserve"> API design decides </w:t>
+      </w:r>
+      <w:r>
+        <w:rPr>
+          <w:b/>
+          <w:bCs/>
+          <w:sz w:val="32"/>
+          <w:szCs w:val="32"/>
+        </w:rPr>
+        <w:t>where the client should send data</w:t>
+      </w:r>
+    </w:p>
+    <w:p>
+      <w:pPr>
+        <w:rPr>
+          <w:sz w:val="32"/>
+          <w:szCs w:val="32"/>
+        </w:rPr>
+      </w:pPr>
+      <w:r>
+        <w:rPr>
+          <w:sz w:val="32"/>
+          <w:szCs w:val="32"/>
+        </w:rPr>
+        <w:pict w14:anchorId="1121BBA6">
+          <v:rect id="_x0000_i1102" style="width:0;height:1.5pt" o:hralign="center" o:hrstd="t" o:hr="t" fillcolor="#a0a0a0" stroked="f"/>
+        </w:pict>
+      </w:r>
+    </w:p>
+    <w:p>
+      <w:pPr>
+        <w:rPr>
+          <w:sz w:val="32"/>
+          <w:szCs w:val="32"/>
+        </w:rPr>
+      </w:pPr>
     </w:p>
     <w:p>
       <w:pPr>
@@ -5250,6 +8560,119 @@
     </w:lvl>
   </w:abstractNum>
   <w:abstractNum w:abstractNumId="5" w15:restartNumberingAfterBreak="0">
+    <w:nsid w:val="2E9E297B"/>
+    <w:multiLevelType w:val="multilevel"/>
+    <w:tmpl w:val="3176C7C0"/>
+    <w:lvl w:ilvl="0">
+      <w:start w:val="1"/>
+      <w:numFmt w:val="decimal"/>
+      <w:lvlText w:val="%1."/>
+      <w:lvlJc w:val="left"/>
+      <w:pPr>
+        <w:tabs>
+          <w:tab w:val="num" w:pos="720"/>
+        </w:tabs>
+        <w:ind w:left="720" w:hanging="360"/>
+      </w:pPr>
+    </w:lvl>
+    <w:lvl w:ilvl="1" w:tentative="1">
+      <w:start w:val="1"/>
+      <w:numFmt w:val="decimal"/>
+      <w:lvlText w:val="%2."/>
+      <w:lvlJc w:val="left"/>
+      <w:pPr>
+        <w:tabs>
+          <w:tab w:val="num" w:pos="1440"/>
+        </w:tabs>
+        <w:ind w:left="1440" w:hanging="360"/>
+      </w:pPr>
+    </w:lvl>
+    <w:lvl w:ilvl="2" w:tentative="1">
+      <w:start w:val="1"/>
+      <w:numFmt w:val="decimal"/>
+      <w:lvlText w:val="%3."/>
+      <w:lvlJc w:val="left"/>
+      <w:pPr>
+        <w:tabs>
+          <w:tab w:val="num" w:pos="2160"/>
+        </w:tabs>
+        <w:ind w:left="2160" w:hanging="360"/>
+      </w:pPr>
+    </w:lvl>
+    <w:lvl w:ilvl="3" w:tentative="1">
+      <w:start w:val="1"/>
+      <w:numFmt w:val="decimal"/>
+      <w:lvlText w:val="%4."/>
+      <w:lvlJc w:val="left"/>
+      <w:pPr>
+        <w:tabs>
+          <w:tab w:val="num" w:pos="2880"/>
+        </w:tabs>
+        <w:ind w:left="2880" w:hanging="360"/>
+      </w:pPr>
+    </w:lvl>
+    <w:lvl w:ilvl="4" w:tentative="1">
+      <w:start w:val="1"/>
+      <w:numFmt w:val="decimal"/>
+      <w:lvlText w:val="%5."/>
+      <w:lvlJc w:val="left"/>
+      <w:pPr>
+        <w:tabs>
+          <w:tab w:val="num" w:pos="3600"/>
+        </w:tabs>
+        <w:ind w:left="3600" w:hanging="360"/>
+      </w:pPr>
+    </w:lvl>
+    <w:lvl w:ilvl="5" w:tentative="1">
+      <w:start w:val="1"/>
+      <w:numFmt w:val="decimal"/>
+      <w:lvlText w:val="%6."/>
+      <w:lvlJc w:val="left"/>
+      <w:pPr>
+        <w:tabs>
+          <w:tab w:val="num" w:pos="4320"/>
+        </w:tabs>
+        <w:ind w:left="4320" w:hanging="360"/>
+      </w:pPr>
+    </w:lvl>
+    <w:lvl w:ilvl="6" w:tentative="1">
+      <w:start w:val="1"/>
+      <w:numFmt w:val="decimal"/>
+      <w:lvlText w:val="%7."/>
+      <w:lvlJc w:val="left"/>
+      <w:pPr>
+        <w:tabs>
+          <w:tab w:val="num" w:pos="5040"/>
+        </w:tabs>
+        <w:ind w:left="5040" w:hanging="360"/>
+      </w:pPr>
+    </w:lvl>
+    <w:lvl w:ilvl="7" w:tentative="1">
+      <w:start w:val="1"/>
+      <w:numFmt w:val="decimal"/>
+      <w:lvlText w:val="%8."/>
+      <w:lvlJc w:val="left"/>
+      <w:pPr>
+        <w:tabs>
+          <w:tab w:val="num" w:pos="5760"/>
+        </w:tabs>
+        <w:ind w:left="5760" w:hanging="360"/>
+      </w:pPr>
+    </w:lvl>
+    <w:lvl w:ilvl="8" w:tentative="1">
+      <w:start w:val="1"/>
+      <w:numFmt w:val="decimal"/>
+      <w:lvlText w:val="%9."/>
+      <w:lvlJc w:val="left"/>
+      <w:pPr>
+        <w:tabs>
+          <w:tab w:val="num" w:pos="6480"/>
+        </w:tabs>
+        <w:ind w:left="6480" w:hanging="360"/>
+      </w:pPr>
+    </w:lvl>
+  </w:abstractNum>
+  <w:abstractNum w:abstractNumId="6" w15:restartNumberingAfterBreak="0">
     <w:nsid w:val="37865A70"/>
     <w:multiLevelType w:val="multilevel"/>
     <w:tmpl w:val="8F5AD872"/>
@@ -5398,7 +8821,7 @@
       </w:rPr>
     </w:lvl>
   </w:abstractNum>
-  <w:abstractNum w:abstractNumId="6" w15:restartNumberingAfterBreak="0">
+  <w:abstractNum w:abstractNumId="7" w15:restartNumberingAfterBreak="0">
     <w:nsid w:val="389E36E6"/>
     <w:multiLevelType w:val="multilevel"/>
     <w:tmpl w:val="8B18ADC0"/>
@@ -5543,7 +8966,156 @@
       </w:rPr>
     </w:lvl>
   </w:abstractNum>
-  <w:abstractNum w:abstractNumId="7" w15:restartNumberingAfterBreak="0">
+  <w:abstractNum w:abstractNumId="8" w15:restartNumberingAfterBreak="0">
+    <w:nsid w:val="3917671A"/>
+    <w:multiLevelType w:val="multilevel"/>
+    <w:tmpl w:val="20A6CFCA"/>
+    <w:lvl w:ilvl="0">
+      <w:start w:val="1"/>
+      <w:numFmt w:val="bullet"/>
+      <w:lvlText w:val=""/>
+      <w:lvlJc w:val="left"/>
+      <w:pPr>
+        <w:tabs>
+          <w:tab w:val="num" w:pos="720"/>
+        </w:tabs>
+        <w:ind w:left="720" w:hanging="360"/>
+      </w:pPr>
+      <w:rPr>
+        <w:rFonts w:ascii="Symbol" w:hAnsi="Symbol" w:hint="default"/>
+        <w:sz w:val="20"/>
+      </w:rPr>
+    </w:lvl>
+    <w:lvl w:ilvl="1" w:tentative="1">
+      <w:start w:val="1"/>
+      <w:numFmt w:val="bullet"/>
+      <w:lvlText w:val="o"/>
+      <w:lvlJc w:val="left"/>
+      <w:pPr>
+        <w:tabs>
+          <w:tab w:val="num" w:pos="1440"/>
+        </w:tabs>
+        <w:ind w:left="1440" w:hanging="360"/>
+      </w:pPr>
+      <w:rPr>
+        <w:rFonts w:ascii="Courier New" w:hAnsi="Courier New" w:hint="default"/>
+        <w:sz w:val="20"/>
+      </w:rPr>
+    </w:lvl>
+    <w:lvl w:ilvl="2" w:tentative="1">
+      <w:start w:val="1"/>
+      <w:numFmt w:val="bullet"/>
+      <w:lvlText w:val=""/>
+      <w:lvlJc w:val="left"/>
+      <w:pPr>
+        <w:tabs>
+          <w:tab w:val="num" w:pos="2160"/>
+        </w:tabs>
+        <w:ind w:left="2160" w:hanging="360"/>
+      </w:pPr>
+      <w:rPr>
+        <w:rFonts w:ascii="Wingdings" w:hAnsi="Wingdings" w:hint="default"/>
+        <w:sz w:val="20"/>
+      </w:rPr>
+    </w:lvl>
+    <w:lvl w:ilvl="3" w:tentative="1">
+      <w:start w:val="1"/>
+      <w:numFmt w:val="bullet"/>
+      <w:lvlText w:val=""/>
+      <w:lvlJc w:val="left"/>
+      <w:pPr>
+        <w:tabs>
+          <w:tab w:val="num" w:pos="2880"/>
+        </w:tabs>
+        <w:ind w:left="2880" w:hanging="360"/>
+      </w:pPr>
+      <w:rPr>
+        <w:rFonts w:ascii="Wingdings" w:hAnsi="Wingdings" w:hint="default"/>
+        <w:sz w:val="20"/>
+      </w:rPr>
+    </w:lvl>
+    <w:lvl w:ilvl="4" w:tentative="1">
+      <w:start w:val="1"/>
+      <w:numFmt w:val="bullet"/>
+      <w:lvlText w:val=""/>
+      <w:lvlJc w:val="left"/>
+      <w:pPr>
+        <w:tabs>
+          <w:tab w:val="num" w:pos="3600"/>
+        </w:tabs>
+        <w:ind w:left="3600" w:hanging="360"/>
+      </w:pPr>
+      <w:rPr>
+        <w:rFonts w:ascii="Wingdings" w:hAnsi="Wingdings" w:hint="default"/>
+        <w:sz w:val="20"/>
+      </w:rPr>
+    </w:lvl>
+    <w:lvl w:ilvl="5" w:tentative="1">
+      <w:start w:val="1"/>
+      <w:numFmt w:val="bullet"/>
+      <w:lvlText w:val=""/>
+      <w:lvlJc w:val="left"/>
+      <w:pPr>
+        <w:tabs>
+          <w:tab w:val="num" w:pos="4320"/>
+        </w:tabs>
+        <w:ind w:left="4320" w:hanging="360"/>
+      </w:pPr>
+      <w:rPr>
+        <w:rFonts w:ascii="Wingdings" w:hAnsi="Wingdings" w:hint="default"/>
+        <w:sz w:val="20"/>
+      </w:rPr>
+    </w:lvl>
+    <w:lvl w:ilvl="6" w:tentative="1">
+      <w:start w:val="1"/>
+      <w:numFmt w:val="bullet"/>
+      <w:lvlText w:val=""/>
+      <w:lvlJc w:val="left"/>
+      <w:pPr>
+        <w:tabs>
+          <w:tab w:val="num" w:pos="5040"/>
+        </w:tabs>
+        <w:ind w:left="5040" w:hanging="360"/>
+      </w:pPr>
+      <w:rPr>
+        <w:rFonts w:ascii="Wingdings" w:hAnsi="Wingdings" w:hint="default"/>
+        <w:sz w:val="20"/>
+      </w:rPr>
+    </w:lvl>
+    <w:lvl w:ilvl="7" w:tentative="1">
+      <w:start w:val="1"/>
+      <w:numFmt w:val="bullet"/>
+      <w:lvlText w:val=""/>
+      <w:lvlJc w:val="left"/>
+      <w:pPr>
+        <w:tabs>
+          <w:tab w:val="num" w:pos="5760"/>
+        </w:tabs>
+        <w:ind w:left="5760" w:hanging="360"/>
+      </w:pPr>
+      <w:rPr>
+        <w:rFonts w:ascii="Wingdings" w:hAnsi="Wingdings" w:hint="default"/>
+        <w:sz w:val="20"/>
+      </w:rPr>
+    </w:lvl>
+    <w:lvl w:ilvl="8" w:tentative="1">
+      <w:start w:val="1"/>
+      <w:numFmt w:val="bullet"/>
+      <w:lvlText w:val=""/>
+      <w:lvlJc w:val="left"/>
+      <w:pPr>
+        <w:tabs>
+          <w:tab w:val="num" w:pos="6480"/>
+        </w:tabs>
+        <w:ind w:left="6480" w:hanging="360"/>
+      </w:pPr>
+      <w:rPr>
+        <w:rFonts w:ascii="Wingdings" w:hAnsi="Wingdings" w:hint="default"/>
+        <w:sz w:val="20"/>
+      </w:rPr>
+    </w:lvl>
+  </w:abstractNum>
+  <w:abstractNum w:abstractNumId="9" w15:restartNumberingAfterBreak="0">
     <w:nsid w:val="3DF76C14"/>
     <w:multiLevelType w:val="multilevel"/>
     <w:tmpl w:val="2F38EEC8"/>
@@ -5688,7 +9260,7 @@
       </w:rPr>
     </w:lvl>
   </w:abstractNum>
-  <w:abstractNum w:abstractNumId="8" w15:restartNumberingAfterBreak="0">
+  <w:abstractNum w:abstractNumId="10" w15:restartNumberingAfterBreak="0">
     <w:nsid w:val="4D811CF2"/>
     <w:multiLevelType w:val="multilevel"/>
     <w:tmpl w:val="41108662"/>
@@ -5837,7 +9409,7 @@
       </w:rPr>
     </w:lvl>
   </w:abstractNum>
-  <w:abstractNum w:abstractNumId="9" w15:restartNumberingAfterBreak="0">
+  <w:abstractNum w:abstractNumId="11" w15:restartNumberingAfterBreak="0">
     <w:nsid w:val="55EF71EB"/>
     <w:multiLevelType w:val="multilevel"/>
     <w:tmpl w:val="3898694C"/>
@@ -5986,7 +9558,7 @@
       </w:rPr>
     </w:lvl>
   </w:abstractNum>
-  <w:abstractNum w:abstractNumId="10" w15:restartNumberingAfterBreak="0">
+  <w:abstractNum w:abstractNumId="12" w15:restartNumberingAfterBreak="0">
     <w:nsid w:val="666E47D6"/>
     <w:multiLevelType w:val="multilevel"/>
     <w:tmpl w:val="3DC4F65E"/>
@@ -6099,7 +9671,7 @@
       </w:pPr>
     </w:lvl>
   </w:abstractNum>
-  <w:abstractNum w:abstractNumId="11" w15:restartNumberingAfterBreak="0">
+  <w:abstractNum w:abstractNumId="13" w15:restartNumberingAfterBreak="0">
     <w:nsid w:val="6B4D476A"/>
     <w:multiLevelType w:val="multilevel"/>
     <w:tmpl w:val="EE7825A8"/>
@@ -6248,7 +9820,7 @@
       </w:rPr>
     </w:lvl>
   </w:abstractNum>
-  <w:abstractNum w:abstractNumId="12" w15:restartNumberingAfterBreak="0">
+  <w:abstractNum w:abstractNumId="14" w15:restartNumberingAfterBreak="0">
     <w:nsid w:val="70820663"/>
     <w:multiLevelType w:val="multilevel"/>
     <w:tmpl w:val="5E44E168"/>
@@ -6397,7 +9969,7 @@
       </w:rPr>
     </w:lvl>
   </w:abstractNum>
-  <w:abstractNum w:abstractNumId="13" w15:restartNumberingAfterBreak="0">
+  <w:abstractNum w:abstractNumId="15" w15:restartNumberingAfterBreak="0">
     <w:nsid w:val="771B15AD"/>
     <w:multiLevelType w:val="multilevel"/>
     <w:tmpl w:val="6B089BCC"/>
@@ -6510,7 +10082,7 @@
       </w:pPr>
     </w:lvl>
   </w:abstractNum>
-  <w:abstractNum w:abstractNumId="14" w15:restartNumberingAfterBreak="0">
+  <w:abstractNum w:abstractNumId="16" w15:restartNumberingAfterBreak="0">
     <w:nsid w:val="7A6D70E6"/>
     <w:multiLevelType w:val="multilevel"/>
     <w:tmpl w:val="F8EE8688"/>
@@ -6659,7 +10231,7 @@
       </w:rPr>
     </w:lvl>
   </w:abstractNum>
-  <w:abstractNum w:abstractNumId="15" w15:restartNumberingAfterBreak="0">
+  <w:abstractNum w:abstractNumId="17" w15:restartNumberingAfterBreak="0">
     <w:nsid w:val="7B374CDB"/>
     <w:multiLevelType w:val="multilevel"/>
     <w:tmpl w:val="7480B430"/>
@@ -6777,34 +10349,34 @@
     </w:lvl>
   </w:abstractNum>
   <w:num w:numId="1" w16cid:durableId="2011911685">
-    <w:abstractNumId w:val="11"/>
+    <w:abstractNumId w:val="13"/>
   </w:num>
   <w:num w:numId="2" w16cid:durableId="123738963">
-    <w:abstractNumId w:val="7"/>
+    <w:abstractNumId w:val="9"/>
   </w:num>
   <w:num w:numId="3" w16cid:durableId="1793671029">
-    <w:abstractNumId w:val="12"/>
+    <w:abstractNumId w:val="14"/>
   </w:num>
   <w:num w:numId="4" w16cid:durableId="1876767973">
     <w:abstractNumId w:val="3"/>
   </w:num>
   <w:num w:numId="5" w16cid:durableId="1533420573">
-    <w:abstractNumId w:val="14"/>
+    <w:abstractNumId w:val="16"/>
   </w:num>
   <w:num w:numId="6" w16cid:durableId="360976078">
-    <w:abstractNumId w:val="5"/>
+    <w:abstractNumId w:val="6"/>
   </w:num>
   <w:num w:numId="7" w16cid:durableId="936643523">
     <w:abstractNumId w:val="2"/>
   </w:num>
   <w:num w:numId="8" w16cid:durableId="1007487499">
-    <w:abstractNumId w:val="13"/>
+    <w:abstractNumId w:val="15"/>
   </w:num>
   <w:num w:numId="9" w16cid:durableId="17390092">
-    <w:abstractNumId w:val="9"/>
+    <w:abstractNumId w:val="11"/>
   </w:num>
   <w:num w:numId="10" w16cid:durableId="535116830">
-    <w:abstractNumId w:val="6"/>
+    <w:abstractNumId w:val="7"/>
   </w:num>
   <w:num w:numId="11" w16cid:durableId="178549765">
     <w:abstractNumId w:val="1"/>
@@ -6816,13 +10388,19 @@
     <w:abstractNumId w:val="0"/>
   </w:num>
   <w:num w:numId="14" w16cid:durableId="2139911775">
-    <w:abstractNumId w:val="8"/>
+    <w:abstractNumId w:val="10"/>
   </w:num>
   <w:num w:numId="15" w16cid:durableId="643510944">
-    <w:abstractNumId w:val="15"/>
+    <w:abstractNumId w:val="17"/>
   </w:num>
   <w:num w:numId="16" w16cid:durableId="288753572">
-    <w:abstractNumId w:val="10"/>
+    <w:abstractNumId w:val="12"/>
+  </w:num>
+  <w:num w:numId="17" w16cid:durableId="1364749231">
+    <w:abstractNumId w:val="5"/>
+  </w:num>
+  <w:num w:numId="18" w16cid:durableId="2015764054">
+    <w:abstractNumId w:val="8"/>
   </w:num>
 </w:numbering>
 </file>

</xml_diff>